<commit_message>
Ajustes cancelación y reporte de primas en tránsito
</commit_message>
<xml_diff>
--- a/Reportes/Poliza Mujer.docx
+++ b/Reportes/Poliza Mujer.docx
@@ -286,8 +286,13 @@
       <w:r>
         <w:br w:type="column"/>
       </w:r>
-      <w:r>
-        <w:t>Nº:</w:t>
+      <w:proofErr w:type="spellStart"/>
+      <w:r>
+        <w:t>Nº</w:t>
+      </w:r>
+      <w:proofErr w:type="spellEnd"/>
+      <w:r>
+        <w:t>:</w:t>
       </w:r>
       <w:r>
         <w:rPr>
@@ -297,13 +302,24 @@
         <w:t xml:space="preserve"> </w:t>
       </w:r>
       <w:r>
-        <w:t>{custom.Poliza}</w:t>
+        <w:t>{</w:t>
+      </w:r>
+      <w:proofErr w:type="spellStart"/>
+      <w:proofErr w:type="gramStart"/>
+      <w:r>
+        <w:t>custom.Poliza</w:t>
+      </w:r>
+      <w:proofErr w:type="spellEnd"/>
+      <w:proofErr w:type="gramEnd"/>
+      <w:r>
+        <w:t>}</w:t>
       </w:r>
     </w:p>
     <w:p>
       <w:pPr>
         <w:pStyle w:val="Ttulo1"/>
         <w:spacing w:line="160" w:lineRule="exact"/>
+        <w:ind w:right="127"/>
         <w:sectPr>
           <w:type w:val="continuous"/>
           <w:pgSz w:w="12240" w:h="15840"/>
@@ -340,9 +356,9 @@
         <mc:AlternateContent>
           <mc:Choice Requires="wpg">
             <w:drawing>
-              <wp:inline distT="0" distB="0" distL="0" distR="0" wp14:anchorId="318CD3F5" wp14:editId="02AC3034">
-                <wp:extent cx="7210425" cy="168275"/>
-                <wp:effectExtent l="0" t="0" r="0" b="3175"/>
+              <wp:inline distT="0" distB="0" distL="0" distR="0" wp14:anchorId="318CD3F5" wp14:editId="1C7B8173">
+                <wp:extent cx="7234834" cy="162030"/>
+                <wp:effectExtent l="0" t="0" r="23495" b="28575"/>
                 <wp:docPr id="3" name="Group 3"/>
                 <wp:cNvGraphicFramePr>
                   <a:graphicFrameLocks xmlns:a="http://schemas.openxmlformats.org/drawingml/2006/main"/>
@@ -356,9 +372,9 @@
                       <wpg:grpSpPr>
                         <a:xfrm>
                           <a:off x="0" y="0"/>
-                          <a:ext cx="7210425" cy="168275"/>
-                          <a:chOff x="0" y="0"/>
-                          <a:chExt cx="7210425" cy="168275"/>
+                          <a:ext cx="7234834" cy="162030"/>
+                          <a:chOff x="6350" y="6350"/>
+                          <a:chExt cx="7197725" cy="155575"/>
                         </a:xfrm>
                       </wpg:grpSpPr>
                       <wps:wsp>
@@ -415,8 +431,8 @@
                         <wps:cNvSpPr txBox="1"/>
                         <wps:spPr>
                           <a:xfrm>
-                            <a:off x="3673475" y="6350"/>
-                            <a:ext cx="3530600" cy="155575"/>
+                            <a:off x="3673084" y="6350"/>
+                            <a:ext cx="3530738" cy="155575"/>
                           </a:xfrm>
                           <a:prstGeom prst="rect">
                             <a:avLst/>
@@ -462,7 +478,27 @@
                                   <w:b/>
                                   <w:sz w:val="15"/>
                                 </w:rPr>
-                                <w:t>{custom.Asegurado}</w:t>
+                                <w:t>{</w:t>
+                              </w:r>
+                              <w:proofErr w:type="spellStart"/>
+                              <w:proofErr w:type="gramStart"/>
+                              <w:r>
+                                <w:rPr>
+                                  <w:rFonts w:ascii="Arial"/>
+                                  <w:b/>
+                                  <w:sz w:val="15"/>
+                                </w:rPr>
+                                <w:t>custom.Asegurado</w:t>
+                              </w:r>
+                              <w:proofErr w:type="spellEnd"/>
+                              <w:proofErr w:type="gramEnd"/>
+                              <w:r>
+                                <w:rPr>
+                                  <w:rFonts w:ascii="Arial"/>
+                                  <w:b/>
+                                  <w:sz w:val="15"/>
+                                </w:rPr>
+                                <w:t>}</w:t>
                               </w:r>
                             </w:p>
                           </w:txbxContent>
@@ -479,7 +515,7 @@
           </mc:Choice>
           <mc:Fallback>
             <w:pict>
-              <v:group w14:anchorId="318CD3F5" id="Group 3" o:spid="_x0000_s1026" style="width:567.75pt;height:13.25pt;mso-position-horizontal-relative:char;mso-position-vertical-relative:line" coordsize="72104,1682" o:gfxdata="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">
+              <v:group w14:anchorId="318CD3F5" id="Group 3" o:spid="_x0000_s1026" style="width:569.65pt;height:12.75pt;mso-position-horizontal-relative:char;mso-position-vertical-relative:line" coordorigin="63,63" coordsize="71977,1555" o:gfxdata="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">
                 <v:shape id="Graphic 4" o:spid="_x0000_s1027" style="position:absolute;left:63;top:63;width:71977;height:1556;visibility:visible;mso-wrap-style:square;v-text-anchor:top" coordsize="7197725,155575" o:gfxdata="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" path="m,l7197725,r,155575l,155575,,xe" filled="f" strokeweight="1pt">
                   <v:path arrowok="t"/>
                 </v:shape>
@@ -487,7 +523,7 @@
                   <v:stroke joinstyle="miter"/>
                   <v:path gradientshapeok="t" o:connecttype="rect"/>
                 </v:shapetype>
-                <v:shape id="Textbox 5" o:spid="_x0000_s1028" type="#_x0000_t202" style="position:absolute;left:36734;top:63;width:35306;height:1556;visibility:visible;mso-wrap-style:square;v-text-anchor:top" o:gfxdata="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" filled="f" strokeweight="1pt">
+                <v:shape id="Textbox 5" o:spid="_x0000_s1028" type="#_x0000_t202" style="position:absolute;left:36730;top:63;width:35308;height:1556;visibility:visible;mso-wrap-style:square;v-text-anchor:top" o:gfxdata="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" filled="f" strokeweight="1pt">
                   <v:textbox inset="0,0,0,0">
                     <w:txbxContent>
                       <w:p>
@@ -522,7 +558,27 @@
                             <w:b/>
                             <w:sz w:val="15"/>
                           </w:rPr>
-                          <w:t>{custom.Asegurado}</w:t>
+                          <w:t>{</w:t>
+                        </w:r>
+                        <w:proofErr w:type="spellStart"/>
+                        <w:proofErr w:type="gramStart"/>
+                        <w:r>
+                          <w:rPr>
+                            <w:rFonts w:ascii="Arial"/>
+                            <w:b/>
+                            <w:sz w:val="15"/>
+                          </w:rPr>
+                          <w:t>custom.Asegurado</w:t>
+                        </w:r>
+                        <w:proofErr w:type="spellEnd"/>
+                        <w:proofErr w:type="gramEnd"/>
+                        <w:r>
+                          <w:rPr>
+                            <w:rFonts w:ascii="Arial"/>
+                            <w:b/>
+                            <w:sz w:val="15"/>
+                          </w:rPr>
+                          <w:t>}</w:t>
                         </w:r>
                       </w:p>
                     </w:txbxContent>
@@ -557,7 +613,7 @@
         <w:gridCol w:w="1805"/>
         <w:gridCol w:w="1470"/>
         <w:gridCol w:w="465"/>
-        <w:gridCol w:w="3633"/>
+        <w:gridCol w:w="3682"/>
       </w:tblGrid>
       <w:tr>
         <w:trPr>
@@ -764,7 +820,7 @@
         </w:tc>
         <w:tc>
           <w:tcPr>
-            <w:tcW w:w="3633" w:type="dxa"/>
+            <w:tcW w:w="3682" w:type="dxa"/>
             <w:shd w:val="clear" w:color="auto" w:fill="000080"/>
           </w:tcPr>
           <w:p>
@@ -891,7 +947,27 @@
                 <w:spacing w:val="-5"/>
                 <w:sz w:val="14"/>
               </w:rPr>
-              <w:t>{custom.EdadEmi}</w:t>
+              <w:t>{</w:t>
+            </w:r>
+            <w:proofErr w:type="spellStart"/>
+            <w:proofErr w:type="gramStart"/>
+            <w:r>
+              <w:rPr>
+                <w:rFonts w:ascii="Arial MT"/>
+                <w:spacing w:val="-5"/>
+                <w:sz w:val="14"/>
+              </w:rPr>
+              <w:t>custom.EdadEmi</w:t>
+            </w:r>
+            <w:proofErr w:type="spellEnd"/>
+            <w:proofErr w:type="gramEnd"/>
+            <w:r>
+              <w:rPr>
+                <w:rFonts w:ascii="Arial MT"/>
+                <w:spacing w:val="-5"/>
+                <w:sz w:val="14"/>
+              </w:rPr>
+              <w:t>}</w:t>
             </w:r>
           </w:p>
         </w:tc>
@@ -926,13 +1002,33 @@
                 <w:spacing w:val="-2"/>
                 <w:sz w:val="14"/>
               </w:rPr>
-              <w:t>{custom.FNacimiento}</w:t>
+              <w:t>{</w:t>
+            </w:r>
+            <w:proofErr w:type="spellStart"/>
+            <w:proofErr w:type="gramStart"/>
+            <w:r>
+              <w:rPr>
+                <w:rFonts w:ascii="Arial MT"/>
+                <w:spacing w:val="-2"/>
+                <w:sz w:val="14"/>
+              </w:rPr>
+              <w:t>custom.FNacimiento</w:t>
+            </w:r>
+            <w:proofErr w:type="spellEnd"/>
+            <w:proofErr w:type="gramEnd"/>
+            <w:r>
+              <w:rPr>
+                <w:rFonts w:ascii="Arial MT"/>
+                <w:spacing w:val="-2"/>
+                <w:sz w:val="14"/>
+              </w:rPr>
+              <w:t>}</w:t>
             </w:r>
           </w:p>
         </w:tc>
         <w:tc>
           <w:tcPr>
-            <w:tcW w:w="3633" w:type="dxa"/>
+            <w:tcW w:w="3682" w:type="dxa"/>
             <w:vMerge w:val="restart"/>
           </w:tcPr>
           <w:p>
@@ -971,7 +1067,27 @@
                 <w:spacing w:val="-2"/>
                 <w:sz w:val="18"/>
               </w:rPr>
-              <w:t>{custom.Desde}</w:t>
+              <w:t>{</w:t>
+            </w:r>
+            <w:proofErr w:type="spellStart"/>
+            <w:proofErr w:type="gramStart"/>
+            <w:r>
+              <w:rPr>
+                <w:rFonts w:ascii="Arial MT"/>
+                <w:spacing w:val="-2"/>
+                <w:sz w:val="18"/>
+              </w:rPr>
+              <w:t>custom.Desde</w:t>
+            </w:r>
+            <w:proofErr w:type="spellEnd"/>
+            <w:proofErr w:type="gramEnd"/>
+            <w:r>
+              <w:rPr>
+                <w:rFonts w:ascii="Arial MT"/>
+                <w:spacing w:val="-2"/>
+                <w:sz w:val="18"/>
+              </w:rPr>
+              <w:t>}</w:t>
             </w:r>
           </w:p>
           <w:p>
@@ -1398,6 +1514,7 @@
               </w:rPr>
               <w:t xml:space="preserve"> </w:t>
             </w:r>
+            <w:proofErr w:type="gramStart"/>
             <w:r>
               <w:rPr>
                 <w:rFonts w:ascii="Calibri" w:hAnsi="Calibri"/>
@@ -1436,7 +1553,16 @@
                 <w:w w:val="105"/>
                 <w:sz w:val="11"/>
               </w:rPr>
-              <w:t>edad.</w:t>
+              <w:t>edad</w:t>
+            </w:r>
+            <w:proofErr w:type="gramEnd"/>
+            <w:r>
+              <w:rPr>
+                <w:rFonts w:ascii="Calibri" w:hAnsi="Calibri"/>
+                <w:w w:val="105"/>
+                <w:sz w:val="11"/>
+              </w:rPr>
+              <w:t>.</w:t>
             </w:r>
           </w:p>
         </w:tc>
@@ -1576,7 +1702,7 @@
         </w:tc>
         <w:tc>
           <w:tcPr>
-            <w:tcW w:w="3633" w:type="dxa"/>
+            <w:tcW w:w="3682" w:type="dxa"/>
             <w:vMerge/>
             <w:tcBorders>
               <w:top w:val="nil"/>
@@ -1598,7 +1724,7 @@
         </w:trPr>
         <w:tc>
           <w:tcPr>
-            <w:tcW w:w="11348" w:type="dxa"/>
+            <w:tcW w:w="11397" w:type="dxa"/>
             <w:gridSpan w:val="6"/>
             <w:tcBorders>
               <w:bottom w:val="single" w:sz="12" w:space="0" w:color="000000"/>
@@ -1711,7 +1837,7 @@
         </w:trPr>
         <w:tc>
           <w:tcPr>
-            <w:tcW w:w="11348" w:type="dxa"/>
+            <w:tcW w:w="11397" w:type="dxa"/>
             <w:gridSpan w:val="6"/>
             <w:tcBorders>
               <w:top w:val="single" w:sz="12" w:space="0" w:color="000000"/>
@@ -1740,7 +1866,7 @@
             <w:gridSpan w:val="4"/>
             <w:tcBorders>
               <w:top w:val="single" w:sz="12" w:space="0" w:color="000000"/>
-              <w:bottom w:val="dashed" w:sz="4" w:space="0" w:color="000000"/>
+              <w:bottom w:val="single" w:sz="8" w:space="0" w:color="000000"/>
             </w:tcBorders>
             <w:shd w:val="clear" w:color="auto" w:fill="auto"/>
             <w:vAlign w:val="center"/>
@@ -1757,17 +1883,31 @@
               <w:rPr>
                 <w:sz w:val="14"/>
               </w:rPr>
-              <w:t>{#custom}{#Coberturas}{Cobertura}</w:t>
+              <w:t>{#</w:t>
+            </w:r>
+            <w:proofErr w:type="gramStart"/>
+            <w:r>
+              <w:rPr>
+                <w:sz w:val="14"/>
+              </w:rPr>
+              <w:t>custom}{</w:t>
+            </w:r>
+            <w:proofErr w:type="gramEnd"/>
+            <w:r>
+              <w:rPr>
+                <w:sz w:val="14"/>
+              </w:rPr>
+              <w:t>#Coberturas}{Cobertura}</w:t>
             </w:r>
           </w:p>
         </w:tc>
         <w:tc>
           <w:tcPr>
-            <w:tcW w:w="4098" w:type="dxa"/>
+            <w:tcW w:w="4147" w:type="dxa"/>
             <w:gridSpan w:val="2"/>
             <w:tcBorders>
               <w:top w:val="single" w:sz="12" w:space="0" w:color="000000"/>
-              <w:bottom w:val="dashed" w:sz="4" w:space="0" w:color="000000"/>
+              <w:bottom w:val="single" w:sz="8" w:space="0" w:color="000000"/>
             </w:tcBorders>
             <w:shd w:val="clear" w:color="auto" w:fill="auto"/>
             <w:vAlign w:val="center"/>
@@ -1790,7 +1930,21 @@
               <w:rPr>
                 <w:sz w:val="14"/>
               </w:rPr>
-              <w:t>{/}{/}</w:t>
+              <w:t>{</w:t>
+            </w:r>
+            <w:proofErr w:type="gramStart"/>
+            <w:r>
+              <w:rPr>
+                <w:sz w:val="14"/>
+              </w:rPr>
+              <w:t>/}{</w:t>
+            </w:r>
+            <w:proofErr w:type="gramEnd"/>
+            <w:r>
+              <w:rPr>
+                <w:sz w:val="14"/>
+              </w:rPr>
+              <w:t>/}</w:t>
             </w:r>
           </w:p>
         </w:tc>
@@ -1809,10 +1963,12 @@
     <w:p>
       <w:pPr>
         <w:pStyle w:val="Textoindependiente"/>
+        <w:tabs>
+          <w:tab w:val="left" w:pos="11660"/>
+        </w:tabs>
         <w:spacing w:before="7"/>
-        <w:rPr>
-          <w:sz w:val="10"/>
-        </w:rPr>
+        <w:ind w:left="220" w:right="220"/>
+        <w:jc w:val="both"/>
       </w:pPr>
       <w:r>
         <w:rPr>
@@ -1822,16 +1978,16 @@
         <mc:AlternateContent>
           <mc:Choice Requires="wps">
             <w:drawing>
-              <wp:anchor distT="0" distB="0" distL="0" distR="0" simplePos="0" relativeHeight="487589376" behindDoc="1" locked="0" layoutInCell="1" allowOverlap="1" wp14:anchorId="02509BF4" wp14:editId="697B9AD5">
+              <wp:anchor distT="0" distB="0" distL="0" distR="0" simplePos="0" relativeHeight="487589376" behindDoc="1" locked="0" layoutInCell="1" allowOverlap="1" wp14:anchorId="02509BF4" wp14:editId="3E680583">
                 <wp:simplePos x="0" y="0"/>
                 <wp:positionH relativeFrom="page">
-                  <wp:posOffset>149225</wp:posOffset>
+                  <wp:posOffset>155575</wp:posOffset>
                 </wp:positionH>
                 <wp:positionV relativeFrom="paragraph">
-                  <wp:posOffset>99060</wp:posOffset>
+                  <wp:posOffset>53235</wp:posOffset>
                 </wp:positionV>
-                <wp:extent cx="7178675" cy="98425"/>
-                <wp:effectExtent l="0" t="0" r="0" b="0"/>
+                <wp:extent cx="7240905" cy="98425"/>
+                <wp:effectExtent l="0" t="0" r="17145" b="15875"/>
                 <wp:wrapTopAndBottom/>
                 <wp:docPr id="9" name="Textbox 9"/>
                 <wp:cNvGraphicFramePr>
@@ -1846,7 +2002,7 @@
                       <wps:spPr>
                         <a:xfrm>
                           <a:off x="0" y="0"/>
-                          <a:ext cx="7178675" cy="98425"/>
+                          <a:ext cx="7240905" cy="98425"/>
                         </a:xfrm>
                         <a:prstGeom prst="rect">
                           <a:avLst/>
@@ -1894,12 +2050,15 @@
                     </wps:wsp>
                   </a:graphicData>
                 </a:graphic>
+                <wp14:sizeRelH relativeFrom="margin">
+                  <wp14:pctWidth>0</wp14:pctWidth>
+                </wp14:sizeRelH>
               </wp:anchor>
             </w:drawing>
           </mc:Choice>
           <mc:Fallback>
             <w:pict>
-              <v:shape w14:anchorId="02509BF4" id="Textbox 9" o:spid="_x0000_s1029" type="#_x0000_t202" style="position:absolute;margin-left:11.75pt;margin-top:7.8pt;width:565.25pt;height:7.75pt;z-index:-15727104;visibility:visible;mso-wrap-style:square;mso-wrap-distance-left:0;mso-wrap-distance-top:0;mso-wrap-distance-right:0;mso-wrap-distance-bottom:0;mso-position-horizontal:absolute;mso-position-horizontal-relative:page;mso-position-vertical:absolute;mso-position-vertical-relative:text;v-text-anchor:top" o:gfxdata="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" fillcolor="navy" strokeweight="1pt">
+              <v:shape w14:anchorId="02509BF4" id="Textbox 9" o:spid="_x0000_s1029" type="#_x0000_t202" style="position:absolute;left:0;text-align:left;margin-left:12.25pt;margin-top:4.2pt;width:570.15pt;height:7.75pt;z-index:-15727104;visibility:visible;mso-wrap-style:square;mso-width-percent:0;mso-wrap-distance-left:0;mso-wrap-distance-top:0;mso-wrap-distance-right:0;mso-wrap-distance-bottom:0;mso-position-horizontal:absolute;mso-position-horizontal-relative:page;mso-position-vertical:absolute;mso-position-vertical-relative:text;mso-width-percent:0;mso-width-relative:margin;v-text-anchor:top" o:gfxdata="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" fillcolor="navy" strokeweight="1pt">
                 <v:path arrowok="t"/>
                 <v:textbox inset="0,0,0,0">
                   <w:txbxContent>
@@ -1934,14 +2093,6 @@
           </mc:Fallback>
         </mc:AlternateContent>
       </w:r>
-    </w:p>
-    <w:p>
-      <w:pPr>
-        <w:pStyle w:val="Textoindependiente"/>
-        <w:spacing w:before="32" w:line="312" w:lineRule="auto"/>
-        <w:ind w:left="240" w:right="336"/>
-        <w:jc w:val="both"/>
-      </w:pPr>
       <w:r>
         <w:rPr>
           <w:rFonts w:ascii="Arial" w:hAnsi="Arial"/>
@@ -3528,16 +3679,16 @@
         <mc:AlternateContent>
           <mc:Choice Requires="wps">
             <w:drawing>
-              <wp:anchor distT="0" distB="0" distL="0" distR="0" simplePos="0" relativeHeight="487589888" behindDoc="1" locked="0" layoutInCell="1" allowOverlap="1" wp14:anchorId="45EFCA41" wp14:editId="1B2EE72C">
+              <wp:anchor distT="0" distB="0" distL="0" distR="0" simplePos="0" relativeHeight="487589888" behindDoc="1" locked="0" layoutInCell="1" allowOverlap="1" wp14:anchorId="45EFCA41" wp14:editId="13C0B851">
                 <wp:simplePos x="0" y="0"/>
                 <wp:positionH relativeFrom="page">
-                  <wp:posOffset>158750</wp:posOffset>
+                  <wp:posOffset>160655</wp:posOffset>
                 </wp:positionH>
                 <wp:positionV relativeFrom="paragraph">
-                  <wp:posOffset>143167</wp:posOffset>
+                  <wp:posOffset>142875</wp:posOffset>
                 </wp:positionV>
-                <wp:extent cx="7178675" cy="98425"/>
-                <wp:effectExtent l="0" t="0" r="0" b="0"/>
+                <wp:extent cx="7236460" cy="98425"/>
+                <wp:effectExtent l="0" t="0" r="21590" b="15875"/>
                 <wp:wrapTopAndBottom/>
                 <wp:docPr id="10" name="Textbox 10"/>
                 <wp:cNvGraphicFramePr>
@@ -3552,7 +3703,7 @@
                       <wps:spPr>
                         <a:xfrm>
                           <a:off x="0" y="0"/>
-                          <a:ext cx="7178675" cy="98425"/>
+                          <a:ext cx="7236460" cy="98425"/>
                         </a:xfrm>
                         <a:prstGeom prst="rect">
                           <a:avLst/>
@@ -3690,12 +3841,15 @@
                     </wps:wsp>
                   </a:graphicData>
                 </a:graphic>
+                <wp14:sizeRelH relativeFrom="margin">
+                  <wp14:pctWidth>0</wp14:pctWidth>
+                </wp14:sizeRelH>
               </wp:anchor>
             </w:drawing>
           </mc:Choice>
           <mc:Fallback>
             <w:pict>
-              <v:shape w14:anchorId="45EFCA41" id="Textbox 10" o:spid="_x0000_s1030" type="#_x0000_t202" style="position:absolute;margin-left:12.5pt;margin-top:11.25pt;width:565.25pt;height:7.75pt;z-index:-15726592;visibility:visible;mso-wrap-style:square;mso-wrap-distance-left:0;mso-wrap-distance-top:0;mso-wrap-distance-right:0;mso-wrap-distance-bottom:0;mso-position-horizontal:absolute;mso-position-horizontal-relative:page;mso-position-vertical:absolute;mso-position-vertical-relative:text;v-text-anchor:top" o:gfxdata="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" fillcolor="navy" strokeweight="1pt">
+              <v:shape w14:anchorId="45EFCA41" id="Textbox 10" o:spid="_x0000_s1030" type="#_x0000_t202" style="position:absolute;margin-left:12.65pt;margin-top:11.25pt;width:569.8pt;height:7.75pt;z-index:-15726592;visibility:visible;mso-wrap-style:square;mso-width-percent:0;mso-wrap-distance-left:0;mso-wrap-distance-top:0;mso-wrap-distance-right:0;mso-wrap-distance-bottom:0;mso-position-horizontal:absolute;mso-position-horizontal-relative:page;mso-position-vertical:absolute;mso-position-vertical-relative:text;mso-width-percent:0;mso-width-relative:margin;v-text-anchor:top" o:gfxdata="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" fillcolor="navy" strokeweight="1pt">
                 <v:path arrowok="t"/>
                 <v:textbox inset="0,0,0,0">
                   <w:txbxContent>
@@ -3825,7 +3979,7 @@
       <w:pPr>
         <w:pStyle w:val="Textoindependiente"/>
         <w:spacing w:before="27" w:line="312" w:lineRule="auto"/>
-        <w:ind w:left="239" w:right="322"/>
+        <w:ind w:left="239" w:right="220"/>
         <w:jc w:val="both"/>
       </w:pPr>
       <w:r>
@@ -4556,6 +4710,7 @@
         </w:rPr>
         <w:t xml:space="preserve"> </w:t>
       </w:r>
+      <w:proofErr w:type="gramStart"/>
       <w:r>
         <w:rPr>
           <w:w w:val="105"/>
@@ -4574,7 +4729,14 @@
         <w:rPr>
           <w:w w:val="105"/>
         </w:rPr>
-        <w:t>.A.</w:t>
+        <w:t>.</w:t>
+      </w:r>
+      <w:proofErr w:type="gramEnd"/>
+      <w:r>
+        <w:rPr>
+          <w:w w:val="105"/>
+        </w:rPr>
+        <w:t>A.</w:t>
       </w:r>
       <w:r>
         <w:rPr>
@@ -4835,6 +4997,7 @@
         </w:rPr>
         <w:t xml:space="preserve"> </w:t>
       </w:r>
+      <w:proofErr w:type="gramStart"/>
       <w:r>
         <w:rPr>
           <w:w w:val="105"/>
@@ -4854,6 +5017,7 @@
         </w:rPr>
         <w:t>.</w:t>
       </w:r>
+      <w:proofErr w:type="gramEnd"/>
     </w:p>
     <w:p>
       <w:pPr>
@@ -4871,16 +5035,16 @@
         <mc:AlternateContent>
           <mc:Choice Requires="wps">
             <w:drawing>
-              <wp:anchor distT="0" distB="0" distL="0" distR="0" simplePos="0" relativeHeight="487590400" behindDoc="1" locked="0" layoutInCell="1" allowOverlap="1" wp14:anchorId="7167485E" wp14:editId="22501FA2">
+              <wp:anchor distT="0" distB="0" distL="0" distR="0" simplePos="0" relativeHeight="487590400" behindDoc="1" locked="0" layoutInCell="1" allowOverlap="1" wp14:anchorId="7167485E" wp14:editId="594A77A7">
                 <wp:simplePos x="0" y="0"/>
                 <wp:positionH relativeFrom="page">
-                  <wp:posOffset>149225</wp:posOffset>
+                  <wp:posOffset>150495</wp:posOffset>
                 </wp:positionH>
                 <wp:positionV relativeFrom="paragraph">
-                  <wp:posOffset>76102</wp:posOffset>
+                  <wp:posOffset>74295</wp:posOffset>
                 </wp:positionV>
-                <wp:extent cx="7188200" cy="98425"/>
-                <wp:effectExtent l="0" t="0" r="0" b="0"/>
+                <wp:extent cx="7245350" cy="98425"/>
+                <wp:effectExtent l="0" t="0" r="12700" b="15875"/>
                 <wp:wrapTopAndBottom/>
                 <wp:docPr id="11" name="Textbox 11"/>
                 <wp:cNvGraphicFramePr>
@@ -4895,7 +5059,7 @@
                       <wps:spPr>
                         <a:xfrm>
                           <a:off x="0" y="0"/>
-                          <a:ext cx="7188200" cy="98425"/>
+                          <a:ext cx="7245350" cy="98425"/>
                         </a:xfrm>
                         <a:prstGeom prst="rect">
                           <a:avLst/>
@@ -4979,12 +5143,18 @@
                     </wps:wsp>
                   </a:graphicData>
                 </a:graphic>
+                <wp14:sizeRelH relativeFrom="margin">
+                  <wp14:pctWidth>0</wp14:pctWidth>
+                </wp14:sizeRelH>
+                <wp14:sizeRelV relativeFrom="margin">
+                  <wp14:pctHeight>0</wp14:pctHeight>
+                </wp14:sizeRelV>
               </wp:anchor>
             </w:drawing>
           </mc:Choice>
           <mc:Fallback>
             <w:pict>
-              <v:shape w14:anchorId="7167485E" id="Textbox 11" o:spid="_x0000_s1031" type="#_x0000_t202" style="position:absolute;margin-left:11.75pt;margin-top:6pt;width:566pt;height:7.75pt;z-index:-15726080;visibility:visible;mso-wrap-style:square;mso-wrap-distance-left:0;mso-wrap-distance-top:0;mso-wrap-distance-right:0;mso-wrap-distance-bottom:0;mso-position-horizontal:absolute;mso-position-horizontal-relative:page;mso-position-vertical:absolute;mso-position-vertical-relative:text;v-text-anchor:top" o:gfxdata="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" fillcolor="navy" strokeweight="1pt">
+              <v:shape w14:anchorId="7167485E" id="Textbox 11" o:spid="_x0000_s1031" type="#_x0000_t202" style="position:absolute;margin-left:11.85pt;margin-top:5.85pt;width:570.5pt;height:7.75pt;z-index:-15726080;visibility:visible;mso-wrap-style:square;mso-width-percent:0;mso-height-percent:0;mso-wrap-distance-left:0;mso-wrap-distance-top:0;mso-wrap-distance-right:0;mso-wrap-distance-bottom:0;mso-position-horizontal:absolute;mso-position-horizontal-relative:page;mso-position-vertical:absolute;mso-position-vertical-relative:text;mso-width-percent:0;mso-height-percent:0;mso-width-relative:margin;mso-height-relative:margin;v-text-anchor:top" o:gfxdata="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" fillcolor="navy" strokeweight="1pt">
                 <v:path arrowok="t"/>
                 <v:textbox inset="0,0,0,0">
                   <w:txbxContent>
@@ -5060,7 +5230,7 @@
       <w:pPr>
         <w:pStyle w:val="Textoindependiente"/>
         <w:spacing w:before="37" w:line="312" w:lineRule="auto"/>
-        <w:ind w:left="215" w:right="411"/>
+        <w:ind w:left="215" w:right="220"/>
         <w:jc w:val="both"/>
       </w:pPr>
       <w:r>
@@ -5937,7 +6107,7 @@
       <w:pPr>
         <w:pStyle w:val="Textoindependiente"/>
         <w:spacing w:before="2" w:line="312" w:lineRule="auto"/>
-        <w:ind w:left="215" w:right="422"/>
+        <w:ind w:left="215" w:right="220"/>
         <w:jc w:val="both"/>
       </w:pPr>
       <w:r>
@@ -6664,16 +6834,16 @@
         <mc:AlternateContent>
           <mc:Choice Requires="wps">
             <w:drawing>
-              <wp:anchor distT="0" distB="0" distL="0" distR="0" simplePos="0" relativeHeight="487590912" behindDoc="1" locked="0" layoutInCell="1" allowOverlap="1" wp14:anchorId="76DA4976" wp14:editId="2F413C3D">
+              <wp:anchor distT="0" distB="0" distL="0" distR="0" simplePos="0" relativeHeight="487590912" behindDoc="1" locked="0" layoutInCell="1" allowOverlap="1" wp14:anchorId="76DA4976" wp14:editId="395B326E">
                 <wp:simplePos x="0" y="0"/>
                 <wp:positionH relativeFrom="page">
-                  <wp:posOffset>133350</wp:posOffset>
+                  <wp:posOffset>135255</wp:posOffset>
                 </wp:positionH>
                 <wp:positionV relativeFrom="paragraph">
-                  <wp:posOffset>116253</wp:posOffset>
+                  <wp:posOffset>115570</wp:posOffset>
                 </wp:positionV>
-                <wp:extent cx="7165975" cy="98425"/>
-                <wp:effectExtent l="0" t="0" r="0" b="0"/>
+                <wp:extent cx="7259955" cy="98425"/>
+                <wp:effectExtent l="0" t="0" r="17145" b="15875"/>
                 <wp:wrapTopAndBottom/>
                 <wp:docPr id="12" name="Textbox 12"/>
                 <wp:cNvGraphicFramePr>
@@ -6688,7 +6858,7 @@
                       <wps:spPr>
                         <a:xfrm>
                           <a:off x="0" y="0"/>
-                          <a:ext cx="7165975" cy="98425"/>
+                          <a:ext cx="7259955" cy="98425"/>
                         </a:xfrm>
                         <a:prstGeom prst="rect">
                           <a:avLst/>
@@ -6736,12 +6906,15 @@
                     </wps:wsp>
                   </a:graphicData>
                 </a:graphic>
+                <wp14:sizeRelH relativeFrom="margin">
+                  <wp14:pctWidth>0</wp14:pctWidth>
+                </wp14:sizeRelH>
               </wp:anchor>
             </w:drawing>
           </mc:Choice>
           <mc:Fallback>
             <w:pict>
-              <v:shape w14:anchorId="76DA4976" id="Textbox 12" o:spid="_x0000_s1032" type="#_x0000_t202" style="position:absolute;margin-left:10.5pt;margin-top:9.15pt;width:564.25pt;height:7.75pt;z-index:-15725568;visibility:visible;mso-wrap-style:square;mso-wrap-distance-left:0;mso-wrap-distance-top:0;mso-wrap-distance-right:0;mso-wrap-distance-bottom:0;mso-position-horizontal:absolute;mso-position-horizontal-relative:page;mso-position-vertical:absolute;mso-position-vertical-relative:text;v-text-anchor:top" o:gfxdata="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" fillcolor="navy" strokeweight="1pt">
+              <v:shape w14:anchorId="76DA4976" id="Textbox 12" o:spid="_x0000_s1032" type="#_x0000_t202" style="position:absolute;margin-left:10.65pt;margin-top:9.1pt;width:571.65pt;height:7.75pt;z-index:-15725568;visibility:visible;mso-wrap-style:square;mso-width-percent:0;mso-wrap-distance-left:0;mso-wrap-distance-top:0;mso-wrap-distance-right:0;mso-wrap-distance-bottom:0;mso-position-horizontal:absolute;mso-position-horizontal-relative:page;mso-position-vertical:absolute;mso-position-vertical-relative:text;mso-width-percent:0;mso-width-relative:margin;v-text-anchor:top" o:gfxdata="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" fillcolor="navy" strokeweight="1pt">
                 <v:path arrowok="t"/>
                 <v:textbox inset="0,0,0,0">
                   <w:txbxContent>
@@ -6781,7 +6954,7 @@
       <w:pPr>
         <w:pStyle w:val="Textoindependiente"/>
         <w:spacing w:before="57"/>
-        <w:ind w:left="210"/>
+        <w:ind w:left="210" w:right="330"/>
       </w:pPr>
       <w:r>
         <w:rPr>
@@ -6871,7 +7044,8 @@
         <w:tabs>
           <w:tab w:val="left" w:pos="569"/>
         </w:tabs>
-        <w:ind w:left="569" w:hanging="359"/>
+        <w:ind w:left="569" w:right="220" w:hanging="359"/>
+        <w:jc w:val="both"/>
         <w:rPr>
           <w:sz w:val="12"/>
         </w:rPr>
@@ -7121,7 +7295,8 @@
           <w:tab w:val="left" w:pos="569"/>
         </w:tabs>
         <w:spacing w:line="312" w:lineRule="auto"/>
-        <w:ind w:left="390" w:right="253" w:hanging="180"/>
+        <w:ind w:left="390" w:right="220" w:hanging="180"/>
+        <w:jc w:val="both"/>
         <w:rPr>
           <w:sz w:val="12"/>
         </w:rPr>
@@ -7501,6 +7676,7 @@
         </w:rPr>
         <w:t xml:space="preserve"> </w:t>
       </w:r>
+      <w:proofErr w:type="gramStart"/>
       <w:r>
         <w:rPr>
           <w:w w:val="105"/>
@@ -7524,6 +7700,7 @@
         </w:rPr>
         <w:t>y</w:t>
       </w:r>
+      <w:proofErr w:type="gramEnd"/>
       <w:r>
         <w:rPr>
           <w:rFonts w:ascii="Times New Roman" w:hAnsi="Times New Roman"/>
@@ -7869,7 +8046,7 @@
           <w:tab w:val="left" w:pos="569"/>
         </w:tabs>
         <w:spacing w:before="1" w:line="312" w:lineRule="auto"/>
-        <w:ind w:left="390" w:right="233" w:hanging="180"/>
+        <w:ind w:left="390" w:right="220" w:hanging="180"/>
         <w:jc w:val="both"/>
         <w:rPr>
           <w:sz w:val="12"/>
@@ -7961,6 +8138,7 @@
         </w:rPr>
         <w:t xml:space="preserve"> </w:t>
       </w:r>
+      <w:proofErr w:type="spellStart"/>
       <w:r>
         <w:rPr>
           <w:w w:val="105"/>
@@ -7968,6 +8146,7 @@
         </w:rPr>
         <w:t>articulo</w:t>
       </w:r>
+      <w:proofErr w:type="spellEnd"/>
       <w:r>
         <w:rPr>
           <w:rFonts w:ascii="Times New Roman" w:hAnsi="Times New Roman"/>
@@ -8089,6 +8268,7 @@
         </w:rPr>
         <w:t xml:space="preserve"> </w:t>
       </w:r>
+      <w:proofErr w:type="gramStart"/>
       <w:r>
         <w:rPr>
           <w:w w:val="105"/>
@@ -8112,6 +8292,7 @@
         </w:rPr>
         <w:t>:</w:t>
       </w:r>
+      <w:proofErr w:type="gramEnd"/>
       <w:r>
         <w:rPr>
           <w:rFonts w:ascii="Times New Roman" w:hAnsi="Times New Roman"/>
@@ -9589,7 +9770,8 @@
       <w:pPr>
         <w:pStyle w:val="Textoindependiente"/>
         <w:spacing w:before="3" w:line="312" w:lineRule="auto"/>
-        <w:ind w:left="210"/>
+        <w:ind w:left="210" w:right="220"/>
+        <w:jc w:val="both"/>
       </w:pPr>
       <w:r>
         <w:rPr>
@@ -10162,7 +10344,8 @@
       <w:pPr>
         <w:pStyle w:val="Textoindependiente"/>
         <w:spacing w:before="2" w:line="312" w:lineRule="auto"/>
-        <w:ind w:left="210" w:right="115"/>
+        <w:ind w:left="210" w:right="220"/>
+        <w:jc w:val="both"/>
       </w:pPr>
       <w:r>
         <w:rPr>
@@ -10486,6 +10669,7 @@
         </w:rPr>
         <w:t xml:space="preserve"> </w:t>
       </w:r>
+      <w:proofErr w:type="gramStart"/>
       <w:r>
         <w:rPr>
           <w:w w:val="105"/>
@@ -10506,6 +10690,7 @@
         </w:rPr>
         <w:t>los</w:t>
       </w:r>
+      <w:proofErr w:type="gramEnd"/>
       <w:r>
         <w:rPr>
           <w:rFonts w:ascii="Times New Roman" w:hAnsi="Times New Roman"/>
@@ -10690,12 +10875,14 @@
         </w:rPr>
         <w:t xml:space="preserve"> </w:t>
       </w:r>
+      <w:proofErr w:type="spellStart"/>
       <w:r>
         <w:rPr>
           <w:w w:val="105"/>
         </w:rPr>
         <w:t>Proteccion</w:t>
       </w:r>
+      <w:proofErr w:type="spellEnd"/>
       <w:r>
         <w:rPr>
           <w:rFonts w:ascii="Times New Roman" w:hAnsi="Times New Roman"/>
@@ -10740,7 +10927,7 @@
       <w:pPr>
         <w:pStyle w:val="Textoindependiente"/>
         <w:spacing w:before="1" w:after="5"/>
-        <w:ind w:left="210"/>
+        <w:ind w:left="210" w:right="220"/>
       </w:pPr>
       <w:r>
         <w:rPr>
@@ -10880,7 +11067,7 @@
       <w:tblPr>
         <w:tblStyle w:val="TableNormal"/>
         <w:tblW w:w="0" w:type="auto"/>
-        <w:tblInd w:w="160" w:type="dxa"/>
+        <w:tblInd w:w="230" w:type="dxa"/>
         <w:tblBorders>
           <w:top w:val="single" w:sz="8" w:space="0" w:color="000000"/>
           <w:left w:val="single" w:sz="8" w:space="0" w:color="000000"/>
@@ -10893,43 +11080,118 @@
         <w:tblLook w:val="01E0" w:firstRow="1" w:lastRow="1" w:firstColumn="1" w:lastColumn="1" w:noHBand="0" w:noVBand="0"/>
       </w:tblPr>
       <w:tblGrid>
-        <w:gridCol w:w="2245"/>
-        <w:gridCol w:w="2400"/>
+        <w:gridCol w:w="4576"/>
         <w:gridCol w:w="2055"/>
-        <w:gridCol w:w="2385"/>
-        <w:gridCol w:w="2245"/>
+        <w:gridCol w:w="2281"/>
+        <w:gridCol w:w="2528"/>
       </w:tblGrid>
       <w:tr>
         <w:trPr>
-          <w:trHeight w:val="222"/>
+          <w:trHeight w:val="101"/>
         </w:trPr>
         <w:tc>
           <w:tcPr>
-            <w:tcW w:w="11330" w:type="dxa"/>
-            <w:gridSpan w:val="5"/>
+            <w:tcW w:w="11440" w:type="dxa"/>
+            <w:gridSpan w:val="4"/>
             <w:tcBorders>
               <w:bottom w:val="double" w:sz="8" w:space="0" w:color="000000"/>
             </w:tcBorders>
+            <w:shd w:val="clear" w:color="auto" w:fill="000080"/>
+            <w:vAlign w:val="center"/>
           </w:tcPr>
           <w:p>
             <w:pPr>
               <w:pStyle w:val="TableParagraph"/>
+              <w:tabs>
+                <w:tab w:val="left" w:pos="2074"/>
+              </w:tabs>
+              <w:spacing w:before="12" w:line="110" w:lineRule="exact"/>
+              <w:ind w:left="125"/>
+              <w:rPr>
+                <w:b/>
+                <w:position w:val="2"/>
+                <w:sz w:val="12"/>
+              </w:rPr>
+            </w:pPr>
+            <w:r>
+              <w:rPr>
+                <w:b/>
+                <w:color w:val="FFFFFF"/>
+                <w:sz w:val="12"/>
+              </w:rPr>
+              <w:t>CORREDOR</w:t>
+            </w:r>
+            <w:r>
+              <w:rPr>
+                <w:b/>
+                <w:color w:val="FFFFFF"/>
+                <w:sz w:val="12"/>
+              </w:rPr>
+              <w:t xml:space="preserve"> </w:t>
+            </w:r>
+            <w:r>
+              <w:rPr>
+                <w:b/>
+                <w:color w:val="FFFFFF"/>
+                <w:sz w:val="12"/>
+              </w:rPr>
+              <w:t>DE</w:t>
+            </w:r>
+            <w:r>
+              <w:rPr>
+                <w:b/>
+                <w:color w:val="FFFFFF"/>
+                <w:sz w:val="12"/>
+              </w:rPr>
+              <w:t xml:space="preserve"> SEGURO:</w:t>
+            </w:r>
+            <w:r>
               <w:rPr>
                 <w:rFonts w:ascii="Times New Roman"/>
+                <w:color w:val="FFFFFF"/>
                 <w:sz w:val="12"/>
               </w:rPr>
-            </w:pPr>
+              <w:tab/>
+            </w:r>
+            <w:r>
+              <w:rPr>
+                <w:b/>
+                <w:color w:val="FFFFFF"/>
+                <w:sz w:val="12"/>
+              </w:rPr>
+              <w:t>{</w:t>
+            </w:r>
+            <w:proofErr w:type="spellStart"/>
+            <w:proofErr w:type="gramStart"/>
+            <w:r>
+              <w:rPr>
+                <w:b/>
+                <w:color w:val="FFFFFF"/>
+                <w:sz w:val="12"/>
+              </w:rPr>
+              <w:t>custom.Corredor</w:t>
+            </w:r>
+            <w:proofErr w:type="spellEnd"/>
+            <w:proofErr w:type="gramEnd"/>
+            <w:r>
+              <w:rPr>
+                <w:b/>
+                <w:color w:val="FFFFFF"/>
+                <w:sz w:val="12"/>
+              </w:rPr>
+              <w:t>}</w:t>
+            </w:r>
           </w:p>
         </w:tc>
       </w:tr>
       <w:tr>
         <w:trPr>
-          <w:trHeight w:val="140"/>
+          <w:trHeight w:val="101"/>
         </w:trPr>
         <w:tc>
           <w:tcPr>
-            <w:tcW w:w="11330" w:type="dxa"/>
-            <w:gridSpan w:val="5"/>
+            <w:tcW w:w="11440" w:type="dxa"/>
+            <w:gridSpan w:val="4"/>
             <w:tcBorders>
               <w:top w:val="double" w:sz="8" w:space="0" w:color="000000"/>
               <w:bottom w:val="double" w:sz="8" w:space="0" w:color="000000"/>
@@ -10940,14 +11202,11 @@
           <w:p>
             <w:pPr>
               <w:pStyle w:val="TableParagraph"/>
-              <w:tabs>
-                <w:tab w:val="left" w:pos="2069"/>
-              </w:tabs>
-              <w:spacing w:before="10" w:line="110" w:lineRule="exact"/>
-              <w:ind w:left="120"/>
+              <w:spacing w:before="20" w:line="103" w:lineRule="exact"/>
+              <w:ind w:left="330"/>
+              <w:jc w:val="center"/>
               <w:rPr>
                 <w:b/>
-                <w:position w:val="2"/>
                 <w:sz w:val="12"/>
               </w:rPr>
             </w:pPr>
@@ -10957,7 +11216,75 @@
                 <w:color w:val="FFFFFF"/>
                 <w:sz w:val="12"/>
               </w:rPr>
-              <w:t>CORREDOR</w:t>
+              <w:t>BENEFICIARIOS</w:t>
+            </w:r>
+            <w:r>
+              <w:rPr>
+                <w:rFonts w:ascii="Times New Roman"/>
+                <w:color w:val="FFFFFF"/>
+                <w:spacing w:val="-2"/>
+                <w:sz w:val="12"/>
+              </w:rPr>
+              <w:t xml:space="preserve"> </w:t>
+            </w:r>
+            <w:r>
+              <w:rPr>
+                <w:b/>
+                <w:color w:val="FFFFFF"/>
+                <w:sz w:val="12"/>
+              </w:rPr>
+              <w:t>PARA</w:t>
+            </w:r>
+            <w:r>
+              <w:rPr>
+                <w:rFonts w:ascii="Times New Roman"/>
+                <w:color w:val="FFFFFF"/>
+                <w:spacing w:val="-4"/>
+                <w:sz w:val="12"/>
+              </w:rPr>
+              <w:t xml:space="preserve"> </w:t>
+            </w:r>
+            <w:r>
+              <w:rPr>
+                <w:b/>
+                <w:color w:val="FFFFFF"/>
+                <w:sz w:val="12"/>
+              </w:rPr>
+              <w:t>LA</w:t>
+            </w:r>
+            <w:r>
+              <w:rPr>
+                <w:rFonts w:ascii="Times New Roman"/>
+                <w:color w:val="FFFFFF"/>
+                <w:spacing w:val="-5"/>
+                <w:sz w:val="12"/>
+              </w:rPr>
+              <w:t xml:space="preserve"> </w:t>
+            </w:r>
+            <w:r>
+              <w:rPr>
+                <w:b/>
+                <w:color w:val="FFFFFF"/>
+                <w:sz w:val="12"/>
+              </w:rPr>
+              <w:t>COBERTURA</w:t>
+            </w:r>
+            <w:r>
+              <w:rPr>
+                <w:rFonts w:ascii="Times New Roman"/>
+                <w:color w:val="FFFFFF"/>
+                <w:spacing w:val="-4"/>
+                <w:sz w:val="12"/>
+              </w:rPr>
+              <w:t xml:space="preserve"> </w:t>
+            </w:r>
+            <w:r>
+              <w:rPr>
+                <w:b/>
+                <w:color w:val="FFFFFF"/>
+                <w:sz w:val="12"/>
+              </w:rPr>
+              <w:t>DE</w:t>
             </w:r>
             <w:r>
               <w:rPr>
@@ -10972,224 +11299,42 @@
               <w:rPr>
                 <w:b/>
                 <w:color w:val="FFFFFF"/>
-                <w:sz w:val="12"/>
-              </w:rPr>
-              <w:t>DE</w:t>
-            </w:r>
-            <w:r>
-              <w:rPr>
-                <w:rFonts w:ascii="Times New Roman"/>
-                <w:color w:val="FFFFFF"/>
-                <w:sz w:val="12"/>
-              </w:rPr>
-              <w:t xml:space="preserve"> </w:t>
-            </w:r>
-            <w:r>
-              <w:rPr>
-                <w:b/>
-                <w:color w:val="FFFFFF"/>
                 <w:spacing w:val="-2"/>
                 <w:sz w:val="12"/>
               </w:rPr>
-              <w:t>SEGURO:</w:t>
-            </w:r>
-            <w:r>
-              <w:rPr>
-                <w:rFonts w:ascii="Times New Roman"/>
-                <w:color w:val="FFFFFF"/>
-                <w:sz w:val="12"/>
-              </w:rPr>
-              <w:tab/>
-            </w:r>
-            <w:r>
-              <w:rPr>
-                <w:b/>
-                <w:color w:val="FFFFFF"/>
-                <w:position w:val="2"/>
-                <w:sz w:val="12"/>
-              </w:rPr>
-              <w:t>{custom.Corredor}</w:t>
+              <w:t>MUERTE</w:t>
             </w:r>
           </w:p>
         </w:tc>
       </w:tr>
       <w:tr>
         <w:trPr>
-          <w:trHeight w:val="142"/>
+          <w:trHeight w:val="159"/>
         </w:trPr>
         <w:tc>
           <w:tcPr>
-            <w:tcW w:w="11330" w:type="dxa"/>
-            <w:gridSpan w:val="5"/>
+            <w:tcW w:w="4576" w:type="dxa"/>
             <w:tcBorders>
               <w:top w:val="double" w:sz="8" w:space="0" w:color="000000"/>
-              <w:bottom w:val="double" w:sz="8" w:space="0" w:color="000000"/>
+              <w:bottom w:val="single" w:sz="8" w:space="0" w:color="000000"/>
             </w:tcBorders>
-            <w:shd w:val="clear" w:color="auto" w:fill="000080"/>
+            <w:vAlign w:val="center"/>
           </w:tcPr>
           <w:p>
             <w:pPr>
               <w:pStyle w:val="TableParagraph"/>
-              <w:spacing w:before="60" w:line="63" w:lineRule="exact"/>
-              <w:ind w:left="325"/>
               <w:jc w:val="center"/>
               <w:rPr>
-                <w:b/>
                 <w:sz w:val="12"/>
+                <w:szCs w:val="12"/>
               </w:rPr>
             </w:pPr>
             <w:r>
               <w:rPr>
-                <w:b/>
-                <w:color w:val="FFFFFF"/>
                 <w:sz w:val="12"/>
-              </w:rPr>
-              <w:t>BENEFICIARIOS</w:t>
-            </w:r>
-            <w:r>
-              <w:rPr>
-                <w:rFonts w:ascii="Times New Roman"/>
-                <w:color w:val="FFFFFF"/>
-                <w:spacing w:val="-2"/>
-                <w:sz w:val="12"/>
-              </w:rPr>
-              <w:t xml:space="preserve"> </w:t>
-            </w:r>
-            <w:r>
-              <w:rPr>
-                <w:b/>
-                <w:color w:val="FFFFFF"/>
-                <w:sz w:val="12"/>
-              </w:rPr>
-              <w:t>PARA</w:t>
-            </w:r>
-            <w:r>
-              <w:rPr>
-                <w:rFonts w:ascii="Times New Roman"/>
-                <w:color w:val="FFFFFF"/>
-                <w:spacing w:val="-4"/>
-                <w:sz w:val="12"/>
-              </w:rPr>
-              <w:t xml:space="preserve"> </w:t>
-            </w:r>
-            <w:r>
-              <w:rPr>
-                <w:b/>
-                <w:color w:val="FFFFFF"/>
-                <w:sz w:val="12"/>
-              </w:rPr>
-              <w:t>LA</w:t>
-            </w:r>
-            <w:r>
-              <w:rPr>
-                <w:rFonts w:ascii="Times New Roman"/>
-                <w:color w:val="FFFFFF"/>
-                <w:spacing w:val="-5"/>
-                <w:sz w:val="12"/>
-              </w:rPr>
-              <w:t xml:space="preserve"> </w:t>
-            </w:r>
-            <w:r>
-              <w:rPr>
-                <w:b/>
-                <w:color w:val="FFFFFF"/>
-                <w:sz w:val="12"/>
-              </w:rPr>
-              <w:t>COBERTURA</w:t>
-            </w:r>
-            <w:r>
-              <w:rPr>
-                <w:rFonts w:ascii="Times New Roman"/>
-                <w:color w:val="FFFFFF"/>
-                <w:spacing w:val="-4"/>
-                <w:sz w:val="12"/>
-              </w:rPr>
-              <w:t xml:space="preserve"> </w:t>
-            </w:r>
-            <w:r>
-              <w:rPr>
-                <w:b/>
-                <w:color w:val="FFFFFF"/>
-                <w:sz w:val="12"/>
-              </w:rPr>
-              <w:t>DE</w:t>
-            </w:r>
-            <w:r>
-              <w:rPr>
-                <w:rFonts w:ascii="Times New Roman"/>
-                <w:color w:val="FFFFFF"/>
-                <w:spacing w:val="-1"/>
-                <w:sz w:val="12"/>
-              </w:rPr>
-              <w:t xml:space="preserve"> </w:t>
-            </w:r>
-            <w:r>
-              <w:rPr>
-                <w:b/>
-                <w:color w:val="FFFFFF"/>
-                <w:spacing w:val="-2"/>
-                <w:sz w:val="12"/>
-              </w:rPr>
-              <w:t>MUERTE</w:t>
-            </w:r>
-          </w:p>
-        </w:tc>
-      </w:tr>
-      <w:tr>
-        <w:trPr>
-          <w:trHeight w:val="260"/>
-        </w:trPr>
-        <w:tc>
-          <w:tcPr>
-            <w:tcW w:w="2245" w:type="dxa"/>
-            <w:tcBorders>
-              <w:top w:val="double" w:sz="8" w:space="0" w:color="000000"/>
-            </w:tcBorders>
-          </w:tcPr>
-          <w:p>
-            <w:pPr>
-              <w:pStyle w:val="TableParagraph"/>
-              <w:spacing w:before="98" w:line="141" w:lineRule="exact"/>
-              <w:ind w:left="629"/>
-              <w:rPr>
-                <w:rFonts w:ascii="Arial MT"/>
-                <w:sz w:val="14"/>
-              </w:rPr>
-            </w:pPr>
-            <w:r>
-              <w:rPr>
-                <w:rFonts w:ascii="Arial MT"/>
-                <w:spacing w:val="-2"/>
-                <w:sz w:val="14"/>
-              </w:rPr>
-              <w:t>NOMBRES</w:t>
-            </w:r>
-          </w:p>
-        </w:tc>
-        <w:tc>
-          <w:tcPr>
-            <w:tcW w:w="2400" w:type="dxa"/>
-            <w:tcBorders>
-              <w:top w:val="double" w:sz="8" w:space="0" w:color="000000"/>
-            </w:tcBorders>
-          </w:tcPr>
-          <w:p>
-            <w:pPr>
-              <w:pStyle w:val="TableParagraph"/>
-              <w:spacing w:before="98" w:line="141" w:lineRule="exact"/>
-              <w:ind w:left="803"/>
-              <w:rPr>
-                <w:rFonts w:ascii="Arial MT"/>
-                <w:sz w:val="14"/>
-              </w:rPr>
-            </w:pPr>
-            <w:r>
-              <w:rPr>
-                <w:rFonts w:ascii="Arial MT"/>
-                <w:spacing w:val="-2"/>
-                <w:sz w:val="14"/>
-              </w:rPr>
-              <w:t>APELLIDOS</w:t>
+                <w:szCs w:val="12"/>
+              </w:rPr>
+              <w:t>NOMBRE COMPLETO</w:t>
             </w:r>
           </w:p>
         </w:tc>
@@ -11198,198 +11343,549 @@
             <w:tcW w:w="2055" w:type="dxa"/>
             <w:tcBorders>
               <w:top w:val="double" w:sz="8" w:space="0" w:color="000000"/>
+              <w:bottom w:val="single" w:sz="8" w:space="0" w:color="000000"/>
+            </w:tcBorders>
+            <w:vAlign w:val="center"/>
+          </w:tcPr>
+          <w:p>
+            <w:pPr>
+              <w:pStyle w:val="TableParagraph"/>
+              <w:jc w:val="center"/>
+              <w:rPr>
+                <w:sz w:val="12"/>
+                <w:szCs w:val="12"/>
+              </w:rPr>
+            </w:pPr>
+            <w:r>
+              <w:rPr>
+                <w:sz w:val="12"/>
+                <w:szCs w:val="12"/>
+              </w:rPr>
+              <w:t>PARENTESCO</w:t>
+            </w:r>
+          </w:p>
+        </w:tc>
+        <w:tc>
+          <w:tcPr>
+            <w:tcW w:w="2281" w:type="dxa"/>
+            <w:tcBorders>
+              <w:top w:val="double" w:sz="8" w:space="0" w:color="000000"/>
+              <w:bottom w:val="single" w:sz="8" w:space="0" w:color="000000"/>
+            </w:tcBorders>
+            <w:vAlign w:val="center"/>
+          </w:tcPr>
+          <w:p>
+            <w:pPr>
+              <w:pStyle w:val="TableParagraph"/>
+              <w:jc w:val="center"/>
+              <w:rPr>
+                <w:sz w:val="12"/>
+                <w:szCs w:val="12"/>
+              </w:rPr>
+            </w:pPr>
+            <w:r>
+              <w:rPr>
+                <w:sz w:val="12"/>
+                <w:szCs w:val="12"/>
+              </w:rPr>
+              <w:t>No.:</w:t>
+            </w:r>
+            <w:r>
+              <w:rPr>
+                <w:sz w:val="12"/>
+                <w:szCs w:val="12"/>
+              </w:rPr>
+              <w:t xml:space="preserve"> IDENTIDAD</w:t>
+            </w:r>
+          </w:p>
+        </w:tc>
+        <w:tc>
+          <w:tcPr>
+            <w:tcW w:w="2528" w:type="dxa"/>
+            <w:tcBorders>
+              <w:top w:val="double" w:sz="8" w:space="0" w:color="000000"/>
+              <w:bottom w:val="single" w:sz="8" w:space="0" w:color="000000"/>
+            </w:tcBorders>
+            <w:vAlign w:val="center"/>
+          </w:tcPr>
+          <w:p>
+            <w:pPr>
+              <w:pStyle w:val="TableParagraph"/>
+              <w:jc w:val="center"/>
+              <w:rPr>
+                <w:sz w:val="12"/>
+                <w:szCs w:val="12"/>
+              </w:rPr>
+            </w:pPr>
+            <w:r>
+              <w:rPr>
+                <w:sz w:val="12"/>
+                <w:szCs w:val="12"/>
+              </w:rPr>
+              <w:t>%</w:t>
+            </w:r>
+            <w:r>
+              <w:rPr>
+                <w:sz w:val="12"/>
+                <w:szCs w:val="12"/>
+              </w:rPr>
+              <w:t xml:space="preserve"> </w:t>
+            </w:r>
+            <w:r>
+              <w:rPr>
+                <w:sz w:val="12"/>
+                <w:szCs w:val="12"/>
+              </w:rPr>
+              <w:t>DE</w:t>
+            </w:r>
+            <w:r>
+              <w:rPr>
+                <w:sz w:val="12"/>
+                <w:szCs w:val="12"/>
+              </w:rPr>
+              <w:t xml:space="preserve"> PARTICIPACIÓN</w:t>
+            </w:r>
+          </w:p>
+        </w:tc>
+      </w:tr>
+      <w:tr>
+        <w:trPr>
+          <w:trHeight w:val="189"/>
+        </w:trPr>
+        <w:tc>
+          <w:tcPr>
+            <w:tcW w:w="4576" w:type="dxa"/>
+            <w:tcBorders>
+              <w:bottom w:val="single" w:sz="8" w:space="0" w:color="000000"/>
             </w:tcBorders>
           </w:tcPr>
           <w:p>
             <w:pPr>
               <w:pStyle w:val="TableParagraph"/>
-              <w:spacing w:before="98" w:line="141" w:lineRule="exact"/>
-              <w:ind w:left="543"/>
-              <w:rPr>
-                <w:rFonts w:ascii="Arial MT"/>
-                <w:sz w:val="14"/>
+              <w:rPr>
+                <w:sz w:val="12"/>
+                <w:szCs w:val="12"/>
               </w:rPr>
             </w:pPr>
             <w:r>
               <w:rPr>
-                <w:rFonts w:ascii="Arial MT"/>
-                <w:spacing w:val="-2"/>
-                <w:sz w:val="14"/>
-              </w:rPr>
-              <w:t>PARENTESCO</w:t>
+                <w:sz w:val="12"/>
+                <w:szCs w:val="12"/>
+              </w:rPr>
+              <w:t>{#</w:t>
+            </w:r>
+            <w:proofErr w:type="gramStart"/>
+            <w:r>
+              <w:rPr>
+                <w:sz w:val="12"/>
+                <w:szCs w:val="12"/>
+              </w:rPr>
+              <w:t>custom}{</w:t>
+            </w:r>
+            <w:proofErr w:type="gramEnd"/>
+            <w:r>
+              <w:rPr>
+                <w:sz w:val="12"/>
+                <w:szCs w:val="12"/>
+              </w:rPr>
+              <w:t>#Beneficiarios}{nombreCompleto}</w:t>
             </w:r>
           </w:p>
         </w:tc>
         <w:tc>
           <w:tcPr>
-            <w:tcW w:w="2385" w:type="dxa"/>
+            <w:tcW w:w="2055" w:type="dxa"/>
             <w:tcBorders>
-              <w:top w:val="double" w:sz="8" w:space="0" w:color="000000"/>
+              <w:bottom w:val="single" w:sz="8" w:space="0" w:color="000000"/>
             </w:tcBorders>
           </w:tcPr>
           <w:p>
             <w:pPr>
               <w:pStyle w:val="TableParagraph"/>
-              <w:spacing w:before="98" w:line="141" w:lineRule="exact"/>
-              <w:ind w:left="440"/>
-              <w:rPr>
-                <w:rFonts w:ascii="Arial MT"/>
-                <w:sz w:val="14"/>
+              <w:jc w:val="center"/>
+              <w:rPr>
+                <w:sz w:val="12"/>
+                <w:szCs w:val="12"/>
               </w:rPr>
             </w:pPr>
             <w:r>
               <w:rPr>
-                <w:rFonts w:ascii="Arial MT"/>
-                <w:sz w:val="14"/>
-              </w:rPr>
-              <w:t>No.:</w:t>
-            </w:r>
-            <w:r>
-              <w:rPr>
-                <w:rFonts w:ascii="Times New Roman"/>
-                <w:spacing w:val="9"/>
-                <w:sz w:val="14"/>
-              </w:rPr>
-              <w:t xml:space="preserve"> </w:t>
-            </w:r>
-            <w:r>
-              <w:rPr>
-                <w:rFonts w:ascii="Arial MT"/>
-                <w:spacing w:val="-2"/>
-                <w:sz w:val="14"/>
-              </w:rPr>
-              <w:t>IDENTIDAD</w:t>
+                <w:sz w:val="12"/>
+                <w:szCs w:val="12"/>
+              </w:rPr>
+              <w:t>{parentesco}</w:t>
             </w:r>
           </w:p>
         </w:tc>
         <w:tc>
           <w:tcPr>
-            <w:tcW w:w="2245" w:type="dxa"/>
+            <w:tcW w:w="2281" w:type="dxa"/>
             <w:tcBorders>
-              <w:top w:val="double" w:sz="8" w:space="0" w:color="000000"/>
+              <w:bottom w:val="single" w:sz="8" w:space="0" w:color="000000"/>
             </w:tcBorders>
           </w:tcPr>
           <w:p>
             <w:pPr>
               <w:pStyle w:val="TableParagraph"/>
-              <w:spacing w:before="98" w:line="141" w:lineRule="exact"/>
-              <w:ind w:left="361"/>
-              <w:rPr>
-                <w:rFonts w:ascii="Arial MT" w:hAnsi="Arial MT"/>
-                <w:sz w:val="14"/>
+              <w:jc w:val="center"/>
+              <w:rPr>
+                <w:sz w:val="12"/>
+                <w:szCs w:val="12"/>
               </w:rPr>
             </w:pPr>
             <w:r>
               <w:rPr>
-                <w:rFonts w:ascii="Arial MT" w:hAnsi="Arial MT"/>
-                <w:sz w:val="14"/>
-              </w:rPr>
-              <w:t>%</w:t>
-            </w:r>
-            <w:r>
-              <w:rPr>
-                <w:rFonts w:ascii="Times New Roman" w:hAnsi="Times New Roman"/>
-                <w:spacing w:val="7"/>
-                <w:sz w:val="14"/>
-              </w:rPr>
-              <w:t xml:space="preserve"> </w:t>
-            </w:r>
-            <w:r>
-              <w:rPr>
-                <w:rFonts w:ascii="Arial MT" w:hAnsi="Arial MT"/>
-                <w:sz w:val="14"/>
-              </w:rPr>
-              <w:t>DE</w:t>
-            </w:r>
-            <w:r>
-              <w:rPr>
-                <w:rFonts w:ascii="Times New Roman" w:hAnsi="Times New Roman"/>
-                <w:spacing w:val="7"/>
-                <w:sz w:val="14"/>
-              </w:rPr>
-              <w:t xml:space="preserve"> </w:t>
-            </w:r>
-            <w:r>
-              <w:rPr>
-                <w:rFonts w:ascii="Arial MT" w:hAnsi="Arial MT"/>
-                <w:spacing w:val="-2"/>
-                <w:sz w:val="14"/>
-              </w:rPr>
-              <w:t>PARTICIPACIÓN</w:t>
+                <w:sz w:val="12"/>
+                <w:szCs w:val="12"/>
+              </w:rPr>
+              <w:t>{</w:t>
+            </w:r>
+            <w:proofErr w:type="spellStart"/>
+            <w:r>
+              <w:rPr>
+                <w:sz w:val="12"/>
+                <w:szCs w:val="12"/>
+              </w:rPr>
+              <w:t>identificacion</w:t>
+            </w:r>
+            <w:proofErr w:type="spellEnd"/>
+            <w:r>
+              <w:rPr>
+                <w:sz w:val="12"/>
+                <w:szCs w:val="12"/>
+              </w:rPr>
+              <w:t>}</w:t>
+            </w:r>
+          </w:p>
+        </w:tc>
+        <w:tc>
+          <w:tcPr>
+            <w:tcW w:w="2528" w:type="dxa"/>
+            <w:tcBorders>
+              <w:bottom w:val="single" w:sz="8" w:space="0" w:color="000000"/>
+            </w:tcBorders>
+          </w:tcPr>
+          <w:p>
+            <w:pPr>
+              <w:pStyle w:val="TableParagraph"/>
+              <w:jc w:val="center"/>
+              <w:rPr>
+                <w:sz w:val="12"/>
+                <w:szCs w:val="12"/>
+              </w:rPr>
+            </w:pPr>
+            <w:r>
+              <w:rPr>
+                <w:sz w:val="12"/>
+                <w:szCs w:val="12"/>
+              </w:rPr>
+              <w:t>{porcentaje</w:t>
+            </w:r>
+            <w:proofErr w:type="gramStart"/>
+            <w:r>
+              <w:rPr>
+                <w:sz w:val="12"/>
+                <w:szCs w:val="12"/>
+              </w:rPr>
+              <w:t>}{</w:t>
+            </w:r>
+            <w:proofErr w:type="gramEnd"/>
+            <w:r>
+              <w:rPr>
+                <w:sz w:val="12"/>
+                <w:szCs w:val="12"/>
+              </w:rPr>
+              <w:t>/}{/}</w:t>
             </w:r>
           </w:p>
         </w:tc>
       </w:tr>
       <w:tr>
         <w:trPr>
-          <w:trHeight w:val="265"/>
+          <w:trHeight w:val="189"/>
         </w:trPr>
         <w:tc>
           <w:tcPr>
-            <w:tcW w:w="2245" w:type="dxa"/>
+            <w:tcW w:w="6631" w:type="dxa"/>
+            <w:gridSpan w:val="2"/>
+            <w:tcBorders>
+              <w:top w:val="single" w:sz="8" w:space="0" w:color="000000"/>
+              <w:left w:val="nil"/>
+              <w:bottom w:val="nil"/>
+              <w:right w:val="nil"/>
+            </w:tcBorders>
           </w:tcPr>
           <w:p>
             <w:pPr>
               <w:pStyle w:val="TableParagraph"/>
               <w:rPr>
-                <w:rFonts w:ascii="Times New Roman"/>
                 <w:sz w:val="12"/>
+                <w:szCs w:val="12"/>
+              </w:rPr>
+            </w:pPr>
+            <w:r>
+              <w:rPr>
+                <w:sz w:val="12"/>
+                <w:szCs w:val="12"/>
+              </w:rPr>
+              <w:t xml:space="preserve">(*) La suma de los porcentajes de participación de todos los beneficiarios deberá corresponder al 100%. </w:t>
+            </w:r>
+          </w:p>
+          <w:p>
+            <w:pPr>
+              <w:pStyle w:val="TableParagraph"/>
+              <w:rPr>
+                <w:sz w:val="12"/>
+                <w:szCs w:val="12"/>
+              </w:rPr>
+            </w:pPr>
+            <w:r>
+              <w:rPr>
+                <w:sz w:val="12"/>
+                <w:szCs w:val="12"/>
+              </w:rPr>
+              <w:t>(**) Esta información aplica sólo si usted ha aceptado el Seguro de Préstamo Jubilado Protegido.</w:t>
+            </w:r>
+          </w:p>
+          <w:p>
+            <w:pPr>
+              <w:pStyle w:val="TableParagraph"/>
+              <w:jc w:val="center"/>
+              <w:rPr>
+                <w:sz w:val="12"/>
+                <w:szCs w:val="12"/>
+              </w:rPr>
+            </w:pPr>
+          </w:p>
+          <w:p>
+            <w:pPr>
+              <w:pStyle w:val="TableParagraph"/>
+              <w:jc w:val="center"/>
+              <w:rPr>
+                <w:sz w:val="12"/>
+                <w:szCs w:val="12"/>
+              </w:rPr>
+            </w:pPr>
+          </w:p>
+          <w:p>
+            <w:pPr>
+              <w:pStyle w:val="TableParagraph"/>
+              <w:jc w:val="center"/>
+              <w:rPr>
+                <w:sz w:val="12"/>
+                <w:szCs w:val="12"/>
+              </w:rPr>
+            </w:pPr>
+          </w:p>
+          <w:p>
+            <w:pPr>
+              <w:pStyle w:val="TableParagraph"/>
+              <w:jc w:val="center"/>
+              <w:rPr>
+                <w:sz w:val="12"/>
+                <w:szCs w:val="12"/>
+              </w:rPr>
+            </w:pPr>
+          </w:p>
+          <w:p>
+            <w:pPr>
+              <w:pStyle w:val="TableParagraph"/>
+              <w:jc w:val="center"/>
+              <w:rPr>
+                <w:sz w:val="12"/>
+                <w:szCs w:val="12"/>
+              </w:rPr>
+            </w:pPr>
+          </w:p>
+          <w:p>
+            <w:pPr>
+              <w:pStyle w:val="TableParagraph"/>
+              <w:jc w:val="center"/>
+              <w:rPr>
+                <w:sz w:val="12"/>
+                <w:szCs w:val="12"/>
+              </w:rPr>
+            </w:pPr>
+          </w:p>
+          <w:p>
+            <w:pPr>
+              <w:pStyle w:val="TableParagraph"/>
+              <w:jc w:val="center"/>
+              <w:rPr>
+                <w:sz w:val="12"/>
+                <w:szCs w:val="12"/>
+              </w:rPr>
+            </w:pPr>
+          </w:p>
+          <w:p>
+            <w:pPr>
+              <w:pStyle w:val="TableParagraph"/>
+              <w:jc w:val="center"/>
+              <w:rPr>
+                <w:sz w:val="12"/>
+                <w:szCs w:val="12"/>
               </w:rPr>
             </w:pPr>
           </w:p>
         </w:tc>
         <w:tc>
           <w:tcPr>
-            <w:tcW w:w="2400" w:type="dxa"/>
+            <w:tcW w:w="2281" w:type="dxa"/>
+            <w:tcBorders>
+              <w:top w:val="single" w:sz="8" w:space="0" w:color="000000"/>
+              <w:left w:val="nil"/>
+              <w:bottom w:val="nil"/>
+              <w:right w:val="nil"/>
+            </w:tcBorders>
           </w:tcPr>
           <w:p>
             <w:pPr>
               <w:pStyle w:val="TableParagraph"/>
-              <w:rPr>
-                <w:rFonts w:ascii="Times New Roman"/>
+              <w:jc w:val="center"/>
+              <w:rPr>
                 <w:sz w:val="12"/>
+                <w:szCs w:val="12"/>
+              </w:rPr>
+            </w:pPr>
+          </w:p>
+          <w:p>
+            <w:pPr>
+              <w:pStyle w:val="TableParagraph"/>
+              <w:jc w:val="center"/>
+              <w:rPr>
+                <w:sz w:val="12"/>
+                <w:szCs w:val="12"/>
+              </w:rPr>
+            </w:pPr>
+          </w:p>
+          <w:p>
+            <w:pPr>
+              <w:pStyle w:val="TableParagraph"/>
+              <w:jc w:val="center"/>
+              <w:rPr>
+                <w:sz w:val="12"/>
+                <w:szCs w:val="12"/>
+              </w:rPr>
+            </w:pPr>
+            <w:r>
+              <w:rPr>
+                <w:noProof/>
+                <w:sz w:val="12"/>
+                <w:szCs w:val="12"/>
+              </w:rPr>
+              <w:drawing>
+                <wp:anchor distT="0" distB="0" distL="114300" distR="114300" simplePos="0" relativeHeight="251658752" behindDoc="1" locked="0" layoutInCell="1" allowOverlap="1" wp14:anchorId="655BB8D2" wp14:editId="0ACE3D17">
+                  <wp:simplePos x="0" y="0"/>
+                  <wp:positionH relativeFrom="column">
+                    <wp:posOffset>-619125</wp:posOffset>
+                  </wp:positionH>
+                  <wp:positionV relativeFrom="paragraph">
+                    <wp:posOffset>133350</wp:posOffset>
+                  </wp:positionV>
+                  <wp:extent cx="1473200" cy="576580"/>
+                  <wp:effectExtent l="0" t="0" r="0" b="0"/>
+                  <wp:wrapNone/>
+                  <wp:docPr id="123891649" name="Image 17"/>
+                  <wp:cNvGraphicFramePr/>
+                  <a:graphic xmlns:a="http://schemas.openxmlformats.org/drawingml/2006/main">
+                    <a:graphicData uri="http://schemas.openxmlformats.org/drawingml/2006/picture">
+                      <pic:pic xmlns:pic="http://schemas.openxmlformats.org/drawingml/2006/picture">
+                        <pic:nvPicPr>
+                          <pic:cNvPr id="17" name="Image 17"/>
+                          <pic:cNvPicPr/>
+                        </pic:nvPicPr>
+                        <pic:blipFill>
+                          <a:blip r:embed="rId10" cstate="print">
+                            <a:extLst>
+                              <a:ext uri="{28A0092B-C50C-407E-A947-70E740481C1C}">
+                                <a14:useLocalDpi xmlns:a14="http://schemas.microsoft.com/office/drawing/2010/main" val="0"/>
+                              </a:ext>
+                            </a:extLst>
+                          </a:blip>
+                          <a:stretch>
+                            <a:fillRect/>
+                          </a:stretch>
+                        </pic:blipFill>
+                        <pic:spPr>
+                          <a:xfrm>
+                            <a:off x="0" y="0"/>
+                            <a:ext cx="1473200" cy="576580"/>
+                          </a:xfrm>
+                          <a:prstGeom prst="rect">
+                            <a:avLst/>
+                          </a:prstGeom>
+                        </pic:spPr>
+                      </pic:pic>
+                    </a:graphicData>
+                  </a:graphic>
+                  <wp14:sizeRelH relativeFrom="page">
+                    <wp14:pctWidth>0</wp14:pctWidth>
+                  </wp14:sizeRelH>
+                  <wp14:sizeRelV relativeFrom="page">
+                    <wp14:pctHeight>0</wp14:pctHeight>
+                  </wp14:sizeRelV>
+                </wp:anchor>
+              </w:drawing>
+            </w:r>
+          </w:p>
+          <w:p>
+            <w:pPr>
+              <w:pStyle w:val="TableParagraph"/>
+              <w:jc w:val="center"/>
+              <w:rPr>
+                <w:sz w:val="12"/>
+                <w:szCs w:val="12"/>
+              </w:rPr>
+            </w:pPr>
+          </w:p>
+          <w:p>
+            <w:pPr>
+              <w:pStyle w:val="TableParagraph"/>
+              <w:jc w:val="center"/>
+              <w:rPr>
+                <w:sz w:val="12"/>
+                <w:szCs w:val="12"/>
+              </w:rPr>
+            </w:pPr>
+          </w:p>
+          <w:p>
+            <w:pPr>
+              <w:pStyle w:val="TableParagraph"/>
+              <w:jc w:val="center"/>
+              <w:rPr>
+                <w:sz w:val="12"/>
+                <w:szCs w:val="12"/>
+              </w:rPr>
+            </w:pPr>
+          </w:p>
+          <w:p>
+            <w:pPr>
+              <w:pStyle w:val="TableParagraph"/>
+              <w:jc w:val="center"/>
+              <w:rPr>
+                <w:sz w:val="12"/>
+                <w:szCs w:val="12"/>
               </w:rPr>
             </w:pPr>
           </w:p>
         </w:tc>
         <w:tc>
           <w:tcPr>
-            <w:tcW w:w="2055" w:type="dxa"/>
+            <w:tcW w:w="2528" w:type="dxa"/>
+            <w:tcBorders>
+              <w:top w:val="single" w:sz="8" w:space="0" w:color="000000"/>
+              <w:left w:val="nil"/>
+              <w:bottom w:val="nil"/>
+              <w:right w:val="nil"/>
+            </w:tcBorders>
           </w:tcPr>
           <w:p>
             <w:pPr>
               <w:pStyle w:val="TableParagraph"/>
-              <w:rPr>
-                <w:rFonts w:ascii="Times New Roman"/>
+              <w:jc w:val="center"/>
+              <w:rPr>
                 <w:sz w:val="12"/>
-              </w:rPr>
-            </w:pPr>
-          </w:p>
-        </w:tc>
-        <w:tc>
-          <w:tcPr>
-            <w:tcW w:w="2385" w:type="dxa"/>
-          </w:tcPr>
-          <w:p>
-            <w:pPr>
-              <w:pStyle w:val="TableParagraph"/>
-              <w:rPr>
-                <w:rFonts w:ascii="Times New Roman"/>
-                <w:sz w:val="12"/>
-              </w:rPr>
-            </w:pPr>
-          </w:p>
-        </w:tc>
-        <w:tc>
-          <w:tcPr>
-            <w:tcW w:w="2245" w:type="dxa"/>
-          </w:tcPr>
-          <w:p>
-            <w:pPr>
-              <w:pStyle w:val="TableParagraph"/>
-              <w:rPr>
-                <w:rFonts w:ascii="Times New Roman"/>
-                <w:sz w:val="12"/>
+                <w:szCs w:val="12"/>
               </w:rPr>
             </w:pPr>
           </w:p>
@@ -11397,461 +11893,39 @@
       </w:tr>
       <w:tr>
         <w:trPr>
-          <w:trHeight w:val="260"/>
+          <w:trHeight w:val="1179"/>
         </w:trPr>
         <w:tc>
           <w:tcPr>
-            <w:tcW w:w="2245" w:type="dxa"/>
-          </w:tcPr>
-          <w:p>
-            <w:pPr>
-              <w:pStyle w:val="TableParagraph"/>
-              <w:rPr>
-                <w:rFonts w:ascii="Times New Roman"/>
-                <w:sz w:val="12"/>
-              </w:rPr>
-            </w:pPr>
-          </w:p>
-        </w:tc>
-        <w:tc>
-          <w:tcPr>
-            <w:tcW w:w="2400" w:type="dxa"/>
-          </w:tcPr>
-          <w:p>
-            <w:pPr>
-              <w:pStyle w:val="TableParagraph"/>
-              <w:rPr>
-                <w:rFonts w:ascii="Times New Roman"/>
-                <w:sz w:val="12"/>
-              </w:rPr>
-            </w:pPr>
-          </w:p>
-        </w:tc>
-        <w:tc>
-          <w:tcPr>
-            <w:tcW w:w="2055" w:type="dxa"/>
-          </w:tcPr>
-          <w:p>
-            <w:pPr>
-              <w:pStyle w:val="TableParagraph"/>
-              <w:rPr>
-                <w:rFonts w:ascii="Times New Roman"/>
-                <w:sz w:val="12"/>
-              </w:rPr>
-            </w:pPr>
-          </w:p>
-        </w:tc>
-        <w:tc>
-          <w:tcPr>
-            <w:tcW w:w="2385" w:type="dxa"/>
-          </w:tcPr>
-          <w:p>
-            <w:pPr>
-              <w:pStyle w:val="TableParagraph"/>
-              <w:rPr>
-                <w:rFonts w:ascii="Times New Roman"/>
-                <w:sz w:val="12"/>
-              </w:rPr>
-            </w:pPr>
-          </w:p>
-        </w:tc>
-        <w:tc>
-          <w:tcPr>
-            <w:tcW w:w="2245" w:type="dxa"/>
-          </w:tcPr>
-          <w:p>
-            <w:pPr>
-              <w:pStyle w:val="TableParagraph"/>
-              <w:rPr>
-                <w:rFonts w:ascii="Times New Roman"/>
-                <w:sz w:val="12"/>
-              </w:rPr>
-            </w:pPr>
-          </w:p>
-        </w:tc>
-      </w:tr>
-      <w:tr>
-        <w:trPr>
-          <w:trHeight w:val="177"/>
-        </w:trPr>
-        <w:tc>
-          <w:tcPr>
-            <w:tcW w:w="2245" w:type="dxa"/>
+            <w:tcW w:w="4576" w:type="dxa"/>
             <w:tcBorders>
-              <w:bottom w:val="single" w:sz="12" w:space="0" w:color="000000"/>
+              <w:top w:val="nil"/>
+              <w:left w:val="nil"/>
+              <w:bottom w:val="nil"/>
+              <w:right w:val="nil"/>
             </w:tcBorders>
           </w:tcPr>
           <w:p>
             <w:pPr>
               <w:pStyle w:val="TableParagraph"/>
-              <w:rPr>
-                <w:rFonts w:ascii="Times New Roman"/>
-                <w:sz w:val="10"/>
+              <w:jc w:val="center"/>
+              <w:rPr>
+                <w:sz w:val="12"/>
+                <w:szCs w:val="12"/>
               </w:rPr>
             </w:pPr>
-          </w:p>
-        </w:tc>
-        <w:tc>
-          <w:tcPr>
-            <w:tcW w:w="2400" w:type="dxa"/>
-            <w:tcBorders>
-              <w:bottom w:val="single" w:sz="12" w:space="0" w:color="000000"/>
-            </w:tcBorders>
-          </w:tcPr>
-          <w:p>
-            <w:pPr>
-              <w:pStyle w:val="TableParagraph"/>
-              <w:rPr>
-                <w:rFonts w:ascii="Times New Roman"/>
-                <w:sz w:val="10"/>
-              </w:rPr>
-            </w:pPr>
-          </w:p>
-        </w:tc>
-        <w:tc>
-          <w:tcPr>
-            <w:tcW w:w="2055" w:type="dxa"/>
-            <w:tcBorders>
-              <w:bottom w:val="single" w:sz="12" w:space="0" w:color="000000"/>
-            </w:tcBorders>
-          </w:tcPr>
-          <w:p>
-            <w:pPr>
-              <w:pStyle w:val="TableParagraph"/>
-              <w:rPr>
-                <w:rFonts w:ascii="Times New Roman"/>
-                <w:sz w:val="10"/>
-              </w:rPr>
-            </w:pPr>
-          </w:p>
-        </w:tc>
-        <w:tc>
-          <w:tcPr>
-            <w:tcW w:w="2385" w:type="dxa"/>
-            <w:tcBorders>
-              <w:bottom w:val="single" w:sz="12" w:space="0" w:color="000000"/>
-            </w:tcBorders>
-          </w:tcPr>
-          <w:p>
-            <w:pPr>
-              <w:pStyle w:val="TableParagraph"/>
-              <w:rPr>
-                <w:rFonts w:ascii="Times New Roman"/>
-                <w:sz w:val="10"/>
-              </w:rPr>
-            </w:pPr>
-          </w:p>
-        </w:tc>
-        <w:tc>
-          <w:tcPr>
-            <w:tcW w:w="2245" w:type="dxa"/>
-            <w:tcBorders>
-              <w:bottom w:val="single" w:sz="12" w:space="0" w:color="000000"/>
-            </w:tcBorders>
-          </w:tcPr>
-          <w:p>
-            <w:pPr>
-              <w:pStyle w:val="TableParagraph"/>
-              <w:rPr>
-                <w:rFonts w:ascii="Times New Roman"/>
-                <w:sz w:val="10"/>
-              </w:rPr>
-            </w:pPr>
-          </w:p>
-        </w:tc>
-      </w:tr>
-      <w:tr>
-        <w:trPr>
-          <w:trHeight w:val="1845"/>
-        </w:trPr>
-        <w:tc>
-          <w:tcPr>
-            <w:tcW w:w="11330" w:type="dxa"/>
-            <w:gridSpan w:val="5"/>
-            <w:tcBorders>
-              <w:top w:val="single" w:sz="12" w:space="0" w:color="000000"/>
-            </w:tcBorders>
-          </w:tcPr>
-          <w:p>
-            <w:pPr>
-              <w:pStyle w:val="TableParagraph"/>
-              <w:spacing w:before="124"/>
-              <w:ind w:left="170"/>
-              <w:rPr>
-                <w:rFonts w:ascii="Arial MT" w:hAnsi="Arial MT"/>
-                <w:sz w:val="11"/>
-              </w:rPr>
-            </w:pPr>
-            <w:r>
-              <w:rPr>
-                <w:rFonts w:ascii="Arial MT" w:hAnsi="Arial MT"/>
-                <w:sz w:val="11"/>
-              </w:rPr>
-              <w:t>(*)</w:t>
-            </w:r>
-            <w:r>
-              <w:rPr>
-                <w:rFonts w:ascii="Times New Roman" w:hAnsi="Times New Roman"/>
-                <w:spacing w:val="-6"/>
-                <w:sz w:val="11"/>
-              </w:rPr>
-              <w:t xml:space="preserve"> </w:t>
-            </w:r>
-            <w:r>
-              <w:rPr>
-                <w:rFonts w:ascii="Arial MT" w:hAnsi="Arial MT"/>
-                <w:sz w:val="11"/>
-              </w:rPr>
-              <w:t>La</w:t>
-            </w:r>
-            <w:r>
-              <w:rPr>
-                <w:rFonts w:ascii="Times New Roman" w:hAnsi="Times New Roman"/>
-                <w:spacing w:val="-5"/>
-                <w:sz w:val="11"/>
-              </w:rPr>
-              <w:t xml:space="preserve"> </w:t>
-            </w:r>
-            <w:r>
-              <w:rPr>
-                <w:rFonts w:ascii="Arial MT" w:hAnsi="Arial MT"/>
-                <w:sz w:val="11"/>
-              </w:rPr>
-              <w:t>suma</w:t>
-            </w:r>
-            <w:r>
-              <w:rPr>
-                <w:rFonts w:ascii="Times New Roman" w:hAnsi="Times New Roman"/>
-                <w:spacing w:val="-6"/>
-                <w:sz w:val="11"/>
-              </w:rPr>
-              <w:t xml:space="preserve"> </w:t>
-            </w:r>
-            <w:r>
-              <w:rPr>
-                <w:rFonts w:ascii="Arial MT" w:hAnsi="Arial MT"/>
-                <w:sz w:val="11"/>
-              </w:rPr>
-              <w:t>de</w:t>
-            </w:r>
-            <w:r>
-              <w:rPr>
-                <w:rFonts w:ascii="Times New Roman" w:hAnsi="Times New Roman"/>
-                <w:spacing w:val="-5"/>
-                <w:sz w:val="11"/>
-              </w:rPr>
-              <w:t xml:space="preserve"> </w:t>
-            </w:r>
-            <w:r>
-              <w:rPr>
-                <w:rFonts w:ascii="Arial MT" w:hAnsi="Arial MT"/>
-                <w:sz w:val="11"/>
-              </w:rPr>
-              <w:t>los</w:t>
-            </w:r>
-            <w:r>
-              <w:rPr>
-                <w:rFonts w:ascii="Times New Roman" w:hAnsi="Times New Roman"/>
-                <w:spacing w:val="-6"/>
-                <w:sz w:val="11"/>
-              </w:rPr>
-              <w:t xml:space="preserve"> </w:t>
-            </w:r>
-            <w:r>
-              <w:rPr>
-                <w:rFonts w:ascii="Arial MT" w:hAnsi="Arial MT"/>
-                <w:sz w:val="11"/>
-              </w:rPr>
-              <w:t>porcentajes</w:t>
-            </w:r>
-            <w:r>
-              <w:rPr>
-                <w:rFonts w:ascii="Times New Roman" w:hAnsi="Times New Roman"/>
-                <w:spacing w:val="-5"/>
-                <w:sz w:val="11"/>
-              </w:rPr>
-              <w:t xml:space="preserve"> </w:t>
-            </w:r>
-            <w:r>
-              <w:rPr>
-                <w:rFonts w:ascii="Arial MT" w:hAnsi="Arial MT"/>
-                <w:sz w:val="11"/>
-              </w:rPr>
-              <w:t>de</w:t>
-            </w:r>
-            <w:r>
-              <w:rPr>
-                <w:rFonts w:ascii="Times New Roman" w:hAnsi="Times New Roman"/>
-                <w:spacing w:val="-5"/>
-                <w:sz w:val="11"/>
-              </w:rPr>
-              <w:t xml:space="preserve"> </w:t>
-            </w:r>
-            <w:r>
-              <w:rPr>
-                <w:rFonts w:ascii="Arial MT" w:hAnsi="Arial MT"/>
-                <w:sz w:val="11"/>
-              </w:rPr>
-              <w:t>participación</w:t>
-            </w:r>
-            <w:r>
-              <w:rPr>
-                <w:rFonts w:ascii="Times New Roman" w:hAnsi="Times New Roman"/>
-                <w:spacing w:val="-6"/>
-                <w:sz w:val="11"/>
-              </w:rPr>
-              <w:t xml:space="preserve"> </w:t>
-            </w:r>
-            <w:r>
-              <w:rPr>
-                <w:rFonts w:ascii="Arial MT" w:hAnsi="Arial MT"/>
-                <w:sz w:val="11"/>
-              </w:rPr>
-              <w:t>de</w:t>
-            </w:r>
-            <w:r>
-              <w:rPr>
-                <w:rFonts w:ascii="Times New Roman" w:hAnsi="Times New Roman"/>
-                <w:spacing w:val="-5"/>
-                <w:sz w:val="11"/>
-              </w:rPr>
-              <w:t xml:space="preserve"> </w:t>
-            </w:r>
-            <w:r>
-              <w:rPr>
-                <w:rFonts w:ascii="Arial MT" w:hAnsi="Arial MT"/>
-                <w:sz w:val="11"/>
-              </w:rPr>
-              <w:t>todos</w:t>
-            </w:r>
-            <w:r>
-              <w:rPr>
-                <w:rFonts w:ascii="Times New Roman" w:hAnsi="Times New Roman"/>
-                <w:spacing w:val="-6"/>
-                <w:sz w:val="11"/>
-              </w:rPr>
-              <w:t xml:space="preserve"> </w:t>
-            </w:r>
-            <w:r>
-              <w:rPr>
-                <w:rFonts w:ascii="Arial MT" w:hAnsi="Arial MT"/>
-                <w:sz w:val="11"/>
-              </w:rPr>
-              <w:t>los</w:t>
-            </w:r>
-            <w:r>
-              <w:rPr>
-                <w:rFonts w:ascii="Times New Roman" w:hAnsi="Times New Roman"/>
-                <w:spacing w:val="-5"/>
-                <w:sz w:val="11"/>
-              </w:rPr>
-              <w:t xml:space="preserve"> </w:t>
-            </w:r>
-            <w:r>
-              <w:rPr>
-                <w:rFonts w:ascii="Arial MT" w:hAnsi="Arial MT"/>
-                <w:sz w:val="11"/>
-              </w:rPr>
-              <w:t>beneficiarios</w:t>
-            </w:r>
-            <w:r>
-              <w:rPr>
-                <w:rFonts w:ascii="Times New Roman" w:hAnsi="Times New Roman"/>
-                <w:spacing w:val="-5"/>
-                <w:sz w:val="11"/>
-              </w:rPr>
-              <w:t xml:space="preserve"> </w:t>
-            </w:r>
-            <w:r>
-              <w:rPr>
-                <w:rFonts w:ascii="Arial MT" w:hAnsi="Arial MT"/>
-                <w:sz w:val="11"/>
-              </w:rPr>
-              <w:t>deberá</w:t>
-            </w:r>
-            <w:r>
-              <w:rPr>
-                <w:rFonts w:ascii="Times New Roman" w:hAnsi="Times New Roman"/>
-                <w:spacing w:val="-6"/>
-                <w:sz w:val="11"/>
-              </w:rPr>
-              <w:t xml:space="preserve"> </w:t>
-            </w:r>
-            <w:r>
-              <w:rPr>
-                <w:rFonts w:ascii="Arial MT" w:hAnsi="Arial MT"/>
-                <w:sz w:val="11"/>
-              </w:rPr>
-              <w:t>corresponder</w:t>
-            </w:r>
-            <w:r>
-              <w:rPr>
-                <w:rFonts w:ascii="Times New Roman" w:hAnsi="Times New Roman"/>
-                <w:spacing w:val="-5"/>
-                <w:sz w:val="11"/>
-              </w:rPr>
-              <w:t xml:space="preserve"> </w:t>
-            </w:r>
-            <w:r>
-              <w:rPr>
-                <w:rFonts w:ascii="Arial MT" w:hAnsi="Arial MT"/>
-                <w:sz w:val="11"/>
-              </w:rPr>
-              <w:t>al</w:t>
-            </w:r>
-            <w:r>
-              <w:rPr>
-                <w:rFonts w:ascii="Times New Roman" w:hAnsi="Times New Roman"/>
-                <w:spacing w:val="-6"/>
-                <w:sz w:val="11"/>
-              </w:rPr>
-              <w:t xml:space="preserve"> </w:t>
-            </w:r>
-            <w:r>
-              <w:rPr>
-                <w:rFonts w:ascii="Arial MT" w:hAnsi="Arial MT"/>
-                <w:spacing w:val="-2"/>
-                <w:sz w:val="11"/>
-              </w:rPr>
-              <w:t>100%.</w:t>
-            </w:r>
-          </w:p>
-          <w:p>
-            <w:pPr>
-              <w:pStyle w:val="TableParagraph"/>
-              <w:spacing w:before="57"/>
-              <w:rPr>
-                <w:rFonts w:ascii="Arial MT"/>
-                <w:sz w:val="20"/>
-              </w:rPr>
-            </w:pPr>
-          </w:p>
-          <w:p>
-            <w:pPr>
-              <w:pStyle w:val="TableParagraph"/>
-              <w:tabs>
-                <w:tab w:val="left" w:pos="4630"/>
-                <w:tab w:val="left" w:pos="9100"/>
-              </w:tabs>
-              <w:ind w:left="80" w:right="-29"/>
-              <w:rPr>
-                <w:rFonts w:ascii="Arial MT"/>
-                <w:sz w:val="20"/>
-              </w:rPr>
-            </w:pPr>
-            <w:r>
-              <w:rPr>
-                <w:rFonts w:ascii="Arial MT"/>
+            <w:r>
+              <w:rPr>
                 <w:noProof/>
                 <w:sz w:val="20"/>
               </w:rPr>
               <mc:AlternateContent>
                 <mc:Choice Requires="wpg">
                   <w:drawing>
-                    <wp:inline distT="0" distB="0" distL="0" distR="0" wp14:anchorId="74B0BA1D" wp14:editId="3AE0CF17">
+                    <wp:inline distT="0" distB="0" distL="0" distR="0" wp14:anchorId="250A44F1" wp14:editId="1603A420">
                       <wp:extent cx="2549525" cy="12700"/>
                       <wp:effectExtent l="9525" t="0" r="3175" b="6350"/>
-                      <wp:docPr id="13" name="Group 13"/>
+                      <wp:docPr id="524716191" name="Group 13"/>
                       <wp:cNvGraphicFramePr>
                         <a:graphicFrameLocks xmlns:a="http://schemas.openxmlformats.org/drawingml/2006/main"/>
                       </wp:cNvGraphicFramePr>
@@ -11870,7 +11944,7 @@
                               </a:xfrm>
                             </wpg:grpSpPr>
                             <wps:wsp>
-                              <wps:cNvPr id="14" name="Graphic 14"/>
+                              <wps:cNvPr id="122028746" name="Graphic 14"/>
                               <wps:cNvSpPr/>
                               <wps:spPr>
                                 <a:xfrm>
@@ -11916,8 +11990,8 @@
                 </mc:Choice>
                 <mc:Fallback>
                   <w:pict>
-                    <v:group w14:anchorId="243DF0E6" id="Group 13" o:spid="_x0000_s1026" style="width:200.75pt;height:1pt;mso-position-horizontal-relative:char;mso-position-vertical-relative:line" coordsize="25495,127" o:gfxdata="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">
-                      <v:shape id="Graphic 14" o:spid="_x0000_s1027" style="position:absolute;top:63;width:25495;height:13;visibility:visible;mso-wrap-style:square;v-text-anchor:top" coordsize="2549525,1270" o:gfxdata="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" path="m,l2549525,e" filled="f" strokeweight="1pt">
+                    <v:group w14:anchorId="1E8D0770" id="Group 13" o:spid="_x0000_s1026" style="width:200.75pt;height:1pt;mso-position-horizontal-relative:char;mso-position-vertical-relative:line" coordsize="25495,127" o:gfxdata="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">
+                      <v:shape id="Graphic 14" o:spid="_x0000_s1027" style="position:absolute;top:63;width:25495;height:13;visibility:visible;mso-wrap-style:square;v-text-anchor:top" coordsize="2549525,1270" o:gfxdata="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" path="m,l2549525,e" filled="f" strokeweight="1pt">
                         <v:path arrowok="t"/>
                       </v:shape>
                       <w10:anchorlock/>
@@ -11926,26 +12000,144 @@
                 </mc:Fallback>
               </mc:AlternateContent>
             </w:r>
-            <w:r>
-              <w:rPr>
-                <w:rFonts w:ascii="Arial MT"/>
-                <w:sz w:val="20"/>
-              </w:rPr>
-              <w:tab/>
-            </w:r>
-            <w:r>
-              <w:rPr>
-                <w:rFonts w:ascii="Arial MT"/>
+          </w:p>
+          <w:p>
+            <w:pPr>
+              <w:pStyle w:val="TableParagraph"/>
+              <w:rPr>
+                <w:b/>
+                <w:position w:val="2"/>
+                <w:sz w:val="14"/>
+              </w:rPr>
+            </w:pPr>
+            <w:r>
+              <w:rPr>
+                <w:b/>
+                <w:position w:val="2"/>
+                <w:sz w:val="14"/>
+              </w:rPr>
+              <w:t xml:space="preserve">      {</w:t>
+            </w:r>
+            <w:proofErr w:type="spellStart"/>
+            <w:proofErr w:type="gramStart"/>
+            <w:r>
+              <w:rPr>
+                <w:b/>
+                <w:position w:val="2"/>
+                <w:sz w:val="14"/>
+              </w:rPr>
+              <w:t>custom.Tenedor</w:t>
+            </w:r>
+            <w:proofErr w:type="spellEnd"/>
+            <w:proofErr w:type="gramEnd"/>
+            <w:r>
+              <w:rPr>
+                <w:b/>
+                <w:position w:val="2"/>
+                <w:sz w:val="14"/>
+              </w:rPr>
+              <w:t>}</w:t>
+            </w:r>
+          </w:p>
+          <w:p>
+            <w:pPr>
+              <w:pStyle w:val="TableParagraph"/>
+              <w:rPr>
+                <w:b/>
+                <w:sz w:val="14"/>
+              </w:rPr>
+            </w:pPr>
+            <w:r>
+              <w:rPr>
+                <w:b/>
+                <w:sz w:val="14"/>
+              </w:rPr>
+              <w:t xml:space="preserve">      No.</w:t>
+            </w:r>
+            <w:r>
+              <w:rPr>
+                <w:rFonts w:ascii="Times New Roman" w:hAnsi="Times New Roman"/>
+                <w:spacing w:val="-8"/>
+                <w:sz w:val="14"/>
+              </w:rPr>
+              <w:t xml:space="preserve"> </w:t>
+            </w:r>
+            <w:r>
+              <w:rPr>
+                <w:b/>
+                <w:sz w:val="14"/>
+              </w:rPr>
+              <w:t>Cédula:</w:t>
+            </w:r>
+            <w:r>
+              <w:rPr>
+                <w:rFonts w:ascii="Times New Roman" w:hAnsi="Times New Roman"/>
+                <w:spacing w:val="-7"/>
+                <w:sz w:val="14"/>
+              </w:rPr>
+              <w:t xml:space="preserve"> </w:t>
+            </w:r>
+            <w:r>
+              <w:rPr>
+                <w:b/>
+                <w:sz w:val="14"/>
+              </w:rPr>
+              <w:t>{</w:t>
+            </w:r>
+            <w:proofErr w:type="spellStart"/>
+            <w:proofErr w:type="gramStart"/>
+            <w:r>
+              <w:rPr>
+                <w:b/>
+                <w:sz w:val="14"/>
+              </w:rPr>
+              <w:t>custom.Identificacion</w:t>
+            </w:r>
+            <w:proofErr w:type="spellEnd"/>
+            <w:proofErr w:type="gramEnd"/>
+            <w:r>
+              <w:rPr>
+                <w:b/>
+                <w:sz w:val="14"/>
+              </w:rPr>
+              <w:t>}</w:t>
+            </w:r>
+          </w:p>
+          <w:p/>
+          <w:p/>
+        </w:tc>
+        <w:tc>
+          <w:tcPr>
+            <w:tcW w:w="4336" w:type="dxa"/>
+            <w:gridSpan w:val="2"/>
+            <w:tcBorders>
+              <w:top w:val="nil"/>
+              <w:left w:val="nil"/>
+              <w:bottom w:val="nil"/>
+              <w:right w:val="nil"/>
+            </w:tcBorders>
+          </w:tcPr>
+          <w:p>
+            <w:pPr>
+              <w:pStyle w:val="TableParagraph"/>
+              <w:jc w:val="center"/>
+              <w:rPr>
+                <w:sz w:val="12"/>
+                <w:szCs w:val="12"/>
+              </w:rPr>
+            </w:pPr>
+            <w:r>
+              <w:rPr>
                 <w:noProof/>
                 <w:sz w:val="20"/>
               </w:rPr>
               <mc:AlternateContent>
                 <mc:Choice Requires="wpg">
                   <w:drawing>
-                    <wp:inline distT="0" distB="0" distL="0" distR="0" wp14:anchorId="5D757634" wp14:editId="7E44825A">
-                      <wp:extent cx="2447925" cy="419100"/>
-                      <wp:effectExtent l="9525" t="0" r="0" b="0"/>
-                      <wp:docPr id="15" name="Group 15"/>
+                    <wp:inline distT="0" distB="0" distL="0" distR="0" wp14:anchorId="24BC198C" wp14:editId="5F2CD2FE">
+                      <wp:extent cx="1971675" cy="45719"/>
+                      <wp:effectExtent l="0" t="0" r="0" b="0"/>
+                      <wp:docPr id="88973456" name="Group 18"/>
                       <wp:cNvGraphicFramePr>
                         <a:graphicFrameLocks xmlns:a="http://schemas.openxmlformats.org/drawingml/2006/main"/>
                       </wp:cNvGraphicFramePr>
@@ -11958,150 +12150,13 @@
                             <wpg:grpSpPr>
                               <a:xfrm>
                                 <a:off x="0" y="0"/>
-                                <a:ext cx="2447925" cy="419100"/>
-                                <a:chOff x="0" y="0"/>
-                                <a:chExt cx="2447925" cy="419100"/>
-                              </a:xfrm>
-                            </wpg:grpSpPr>
-                            <wps:wsp>
-                              <wps:cNvPr id="16" name="Graphic 16"/>
-                              <wps:cNvSpPr/>
-                              <wps:spPr>
-                                <a:xfrm>
-                                  <a:off x="0" y="412750"/>
-                                  <a:ext cx="2447925" cy="1270"/>
-                                </a:xfrm>
-                                <a:custGeom>
-                                  <a:avLst/>
-                                  <a:gdLst/>
-                                  <a:ahLst/>
-                                  <a:cxnLst/>
-                                  <a:rect l="l" t="t" r="r" b="b"/>
-                                  <a:pathLst>
-                                    <a:path w="2447925">
-                                      <a:moveTo>
-                                        <a:pt x="0" y="0"/>
-                                      </a:moveTo>
-                                      <a:lnTo>
-                                        <a:pt x="2447925" y="0"/>
-                                      </a:lnTo>
-                                    </a:path>
-                                  </a:pathLst>
-                                </a:custGeom>
-                                <a:ln w="12700">
-                                  <a:solidFill>
-                                    <a:srgbClr val="000000"/>
-                                  </a:solidFill>
-                                  <a:prstDash val="solid"/>
-                                </a:ln>
-                              </wps:spPr>
-                              <wps:bodyPr wrap="square" lIns="0" tIns="0" rIns="0" bIns="0" rtlCol="0">
-                                <a:prstTxWarp prst="textNoShape">
-                                  <a:avLst/>
-                                </a:prstTxWarp>
-                                <a:noAutofit/>
-                              </wps:bodyPr>
-                            </wps:wsp>
-                            <pic:pic xmlns:pic="http://schemas.openxmlformats.org/drawingml/2006/picture">
-                              <pic:nvPicPr>
-                                <pic:cNvPr id="17" name="Image 17"/>
-                                <pic:cNvPicPr/>
-                              </pic:nvPicPr>
-                              <pic:blipFill>
-                                <a:blip r:embed="rId10" cstate="print"/>
-                                <a:stretch>
-                                  <a:fillRect/>
-                                </a:stretch>
-                              </pic:blipFill>
-                              <pic:spPr>
-                                <a:xfrm>
-                                  <a:off x="368300" y="0"/>
-                                  <a:ext cx="1905000" cy="379730"/>
-                                </a:xfrm>
-                                <a:prstGeom prst="rect">
-                                  <a:avLst/>
-                                </a:prstGeom>
-                              </pic:spPr>
-                            </pic:pic>
-                          </wpg:wgp>
-                        </a:graphicData>
-                      </a:graphic>
-                    </wp:inline>
-                  </w:drawing>
-                </mc:Choice>
-                <mc:Fallback>
-                  <w:pict>
-                    <v:group w14:anchorId="1FA9ADDE" id="Group 15" o:spid="_x0000_s1026" style="width:192.75pt;height:33pt;mso-position-horizontal-relative:char;mso-position-vertical-relative:line" coordsize="24479,4191" o:gfxdata="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">
-                      <v:shape id="Graphic 16" o:spid="_x0000_s1027" style="position:absolute;top:4127;width:24479;height:13;visibility:visible;mso-wrap-style:square;v-text-anchor:top" coordsize="2447925,1270" o:gfxdata="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" path="m,l2447925,e" filled="f" strokeweight="1pt">
-                        <v:path arrowok="t"/>
-                      </v:shape>
-                      <v:shapetype id="_x0000_t75" coordsize="21600,21600" o:spt="75" o:preferrelative="t" path="m@4@5l@4@11@9@11@9@5xe" filled="f" stroked="f">
-                        <v:stroke joinstyle="miter"/>
-                        <v:formulas>
-                          <v:f eqn="if lineDrawn pixelLineWidth 0"/>
-                          <v:f eqn="sum @0 1 0"/>
-                          <v:f eqn="sum 0 0 @1"/>
-                          <v:f eqn="prod @2 1 2"/>
-                          <v:f eqn="prod @3 21600 pixelWidth"/>
-                          <v:f eqn="prod @3 21600 pixelHeight"/>
-                          <v:f eqn="sum @0 0 1"/>
-                          <v:f eqn="prod @6 1 2"/>
-                          <v:f eqn="prod @7 21600 pixelWidth"/>
-                          <v:f eqn="sum @8 21600 0"/>
-                          <v:f eqn="prod @7 21600 pixelHeight"/>
-                          <v:f eqn="sum @10 21600 0"/>
-                        </v:formulas>
-                        <v:path o:extrusionok="f" gradientshapeok="t" o:connecttype="rect"/>
-                        <o:lock v:ext="edit" aspectratio="t"/>
-                      </v:shapetype>
-                      <v:shape id="Image 17" o:spid="_x0000_s1028" type="#_x0000_t75" style="position:absolute;left:3683;width:19050;height:3797;visibility:visible;mso-wrap-style:square" o:gfxdata="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">
-                        <v:imagedata r:id="rId11" o:title=""/>
-                      </v:shape>
-                      <w10:anchorlock/>
-                    </v:group>
-                  </w:pict>
-                </mc:Fallback>
-              </mc:AlternateContent>
-            </w:r>
-            <w:r>
-              <w:rPr>
-                <w:rFonts w:ascii="Arial MT"/>
-                <w:sz w:val="20"/>
-              </w:rPr>
-              <w:tab/>
-            </w:r>
-            <w:r>
-              <w:rPr>
-                <w:rFonts w:ascii="Arial MT"/>
-                <w:noProof/>
-                <w:sz w:val="20"/>
-              </w:rPr>
-              <mc:AlternateContent>
-                <mc:Choice Requires="wpg">
-                  <w:drawing>
-                    <wp:inline distT="0" distB="0" distL="0" distR="0" wp14:anchorId="2549B241" wp14:editId="17482F53">
-                      <wp:extent cx="1384300" cy="12700"/>
-                      <wp:effectExtent l="9525" t="0" r="6350" b="6350"/>
-                      <wp:docPr id="18" name="Group 18"/>
-                      <wp:cNvGraphicFramePr>
-                        <a:graphicFrameLocks xmlns:a="http://schemas.openxmlformats.org/drawingml/2006/main"/>
-                      </wp:cNvGraphicFramePr>
-                      <a:graphic xmlns:a="http://schemas.openxmlformats.org/drawingml/2006/main">
-                        <a:graphicData uri="http://schemas.microsoft.com/office/word/2010/wordprocessingGroup">
-                          <wpg:wgp>
-                            <wpg:cNvGrpSpPr>
-                              <a:grpSpLocks/>
-                            </wpg:cNvGrpSpPr>
-                            <wpg:grpSpPr>
-                              <a:xfrm>
-                                <a:off x="0" y="0"/>
-                                <a:ext cx="1384300" cy="12700"/>
+                                <a:ext cx="1971675" cy="45719"/>
                                 <a:chOff x="0" y="0"/>
                                 <a:chExt cx="1384300" cy="12700"/>
                               </a:xfrm>
                             </wpg:grpSpPr>
                             <wps:wsp>
-                              <wps:cNvPr id="19" name="Graphic 19"/>
+                              <wps:cNvPr id="508014640" name="Graphic 19"/>
                               <wps:cNvSpPr/>
                               <wps:spPr>
                                 <a:xfrm>
@@ -12147,8 +12202,8 @@
                 </mc:Choice>
                 <mc:Fallback>
                   <w:pict>
-                    <v:group w14:anchorId="13B8AEFD" id="Group 18" o:spid="_x0000_s1026" style="width:109pt;height:1pt;mso-position-horizontal-relative:char;mso-position-vertical-relative:line" coordsize="13843,127" o:gfxdata="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">
-                      <v:shape id="Graphic 19" o:spid="_x0000_s1027" style="position:absolute;top:63;width:13843;height:13;visibility:visible;mso-wrap-style:square;v-text-anchor:top" coordsize="1384300,1270" o:gfxdata="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" path="m,l1384300,e" filled="f" strokeweight="1pt">
+                    <v:group w14:anchorId="2A17FD55" id="Group 18" o:spid="_x0000_s1026" style="width:155.25pt;height:3.6pt;mso-position-horizontal-relative:char;mso-position-vertical-relative:line" coordsize="13843,127" o:gfxdata="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">
+                      <v:shape id="Graphic 19" o:spid="_x0000_s1027" style="position:absolute;top:63;width:13843;height:13;visibility:visible;mso-wrap-style:square;v-text-anchor:top" coordsize="1384300,1270" o:gfxdata="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" path="m,l1384300,e" filled="f" strokeweight="1pt">
                         <v:path arrowok="t"/>
                       </v:shape>
                       <w10:anchorlock/>
@@ -12161,35 +12216,12 @@
           <w:p>
             <w:pPr>
               <w:pStyle w:val="TableParagraph"/>
-              <w:tabs>
-                <w:tab w:val="left" w:pos="5556"/>
-                <w:tab w:val="left" w:pos="9600"/>
-                <w:tab w:val="left" w:pos="9794"/>
-              </w:tabs>
-              <w:spacing w:line="254" w:lineRule="auto"/>
-              <w:ind w:left="6196" w:right="478" w:hanging="6076"/>
-              <w:rPr>
-                <w:rFonts w:ascii="Arial MT"/>
-                <w:position w:val="-8"/>
-                <w:sz w:val="18"/>
+              <w:jc w:val="center"/>
+              <w:rPr>
+                <w:sz w:val="12"/>
+                <w:szCs w:val="12"/>
               </w:rPr>
             </w:pPr>
-            <w:r>
-              <w:rPr>
-                <w:b/>
-                <w:position w:val="2"/>
-                <w:sz w:val="14"/>
-              </w:rPr>
-              <w:t>{custom.Asegurado}</w:t>
-            </w:r>
-            <w:r>
-              <w:rPr>
-                <w:rFonts w:ascii="Times New Roman"/>
-                <w:position w:val="2"/>
-                <w:sz w:val="14"/>
-              </w:rPr>
-              <w:tab/>
-            </w:r>
             <w:r>
               <w:rPr>
                 <w:b/>
@@ -12230,125 +12262,149 @@
               </w:rPr>
               <w:t>Aseguradora</w:t>
             </w:r>
-            <w:r>
-              <w:rPr>
-                <w:rFonts w:ascii="Times New Roman"/>
-                <w:position w:val="4"/>
-                <w:sz w:val="14"/>
-              </w:rPr>
-              <w:tab/>
-            </w:r>
-            <w:r>
-              <w:rPr>
-                <w:b/>
-                <w:sz w:val="14"/>
-              </w:rPr>
-              <w:t>Fecha</w:t>
-            </w:r>
-            <w:r>
-              <w:rPr>
-                <w:rFonts w:ascii="Times New Roman"/>
-                <w:spacing w:val="-9"/>
-                <w:sz w:val="14"/>
-              </w:rPr>
-              <w:t xml:space="preserve"> </w:t>
-            </w:r>
-            <w:r>
-              <w:rPr>
-                <w:b/>
-                <w:sz w:val="14"/>
-              </w:rPr>
-              <w:t>de</w:t>
-            </w:r>
-            <w:r>
-              <w:rPr>
-                <w:rFonts w:ascii="Times New Roman"/>
-                <w:spacing w:val="-9"/>
-                <w:sz w:val="14"/>
-              </w:rPr>
-              <w:t xml:space="preserve"> </w:t>
-            </w:r>
-            <w:r>
-              <w:rPr>
-                <w:b/>
-                <w:sz w:val="14"/>
-              </w:rPr>
-              <w:t>Recibido</w:t>
-            </w:r>
-            <w:r>
-              <w:rPr>
-                <w:rFonts w:ascii="Times New Roman"/>
-                <w:spacing w:val="40"/>
-                <w:sz w:val="14"/>
-              </w:rPr>
-              <w:t xml:space="preserve"> </w:t>
-            </w:r>
-            <w:r>
-              <w:rPr>
-                <w:b/>
-                <w:sz w:val="14"/>
-              </w:rPr>
-              <w:t>Global</w:t>
-            </w:r>
-            <w:r>
-              <w:rPr>
-                <w:rFonts w:ascii="Times New Roman"/>
-                <w:sz w:val="14"/>
-              </w:rPr>
-              <w:t xml:space="preserve"> </w:t>
-            </w:r>
-            <w:r>
-              <w:rPr>
-                <w:b/>
-                <w:sz w:val="14"/>
-              </w:rPr>
-              <w:t>S.A.</w:t>
-            </w:r>
-            <w:r>
-              <w:rPr>
-                <w:rFonts w:ascii="Times New Roman"/>
-                <w:sz w:val="14"/>
-              </w:rPr>
-              <w:tab/>
-            </w:r>
-            <w:r>
-              <w:rPr>
-                <w:rFonts w:ascii="Times New Roman"/>
-                <w:sz w:val="14"/>
-              </w:rPr>
-              <w:tab/>
-            </w:r>
-            <w:r>
-              <w:rPr>
-                <w:rFonts w:ascii="Arial MT"/>
-                <w:spacing w:val="-2"/>
-                <w:position w:val="-8"/>
-                <w:sz w:val="18"/>
-              </w:rPr>
-              <w:t>{custom.FechaActual}</w:t>
+          </w:p>
+        </w:tc>
+        <w:tc>
+          <w:tcPr>
+            <w:tcW w:w="2528" w:type="dxa"/>
+            <w:tcBorders>
+              <w:top w:val="nil"/>
+              <w:left w:val="nil"/>
+              <w:bottom w:val="nil"/>
+              <w:right w:val="nil"/>
+            </w:tcBorders>
+          </w:tcPr>
+          <w:p>
+            <w:pPr>
+              <w:pStyle w:val="TableParagraph"/>
+              <w:jc w:val="center"/>
+              <w:rPr>
+                <w:sz w:val="12"/>
+                <w:szCs w:val="12"/>
+              </w:rPr>
+            </w:pPr>
+            <w:r>
+              <w:rPr>
+                <w:noProof/>
+                <w:sz w:val="20"/>
+              </w:rPr>
+              <mc:AlternateContent>
+                <mc:Choice Requires="wpg">
+                  <w:drawing>
+                    <wp:inline distT="0" distB="0" distL="0" distR="0" wp14:anchorId="55A750E2" wp14:editId="0ED6DC8D">
+                      <wp:extent cx="1384300" cy="12700"/>
+                      <wp:effectExtent l="9525" t="0" r="6350" b="6350"/>
+                      <wp:docPr id="1768628510" name="Group 18"/>
+                      <wp:cNvGraphicFramePr>
+                        <a:graphicFrameLocks xmlns:a="http://schemas.openxmlformats.org/drawingml/2006/main"/>
+                      </wp:cNvGraphicFramePr>
+                      <a:graphic xmlns:a="http://schemas.openxmlformats.org/drawingml/2006/main">
+                        <a:graphicData uri="http://schemas.microsoft.com/office/word/2010/wordprocessingGroup">
+                          <wpg:wgp>
+                            <wpg:cNvGrpSpPr>
+                              <a:grpSpLocks/>
+                            </wpg:cNvGrpSpPr>
+                            <wpg:grpSpPr>
+                              <a:xfrm>
+                                <a:off x="0" y="0"/>
+                                <a:ext cx="1384300" cy="12700"/>
+                                <a:chOff x="0" y="0"/>
+                                <a:chExt cx="1384300" cy="12700"/>
+                              </a:xfrm>
+                            </wpg:grpSpPr>
+                            <wps:wsp>
+                              <wps:cNvPr id="1204137853" name="Graphic 19"/>
+                              <wps:cNvSpPr/>
+                              <wps:spPr>
+                                <a:xfrm>
+                                  <a:off x="0" y="6350"/>
+                                  <a:ext cx="1384300" cy="1270"/>
+                                </a:xfrm>
+                                <a:custGeom>
+                                  <a:avLst/>
+                                  <a:gdLst/>
+                                  <a:ahLst/>
+                                  <a:cxnLst/>
+                                  <a:rect l="l" t="t" r="r" b="b"/>
+                                  <a:pathLst>
+                                    <a:path w="1384300">
+                                      <a:moveTo>
+                                        <a:pt x="0" y="0"/>
+                                      </a:moveTo>
+                                      <a:lnTo>
+                                        <a:pt x="1384300" y="0"/>
+                                      </a:lnTo>
+                                    </a:path>
+                                  </a:pathLst>
+                                </a:custGeom>
+                                <a:ln w="12700">
+                                  <a:solidFill>
+                                    <a:srgbClr val="000000"/>
+                                  </a:solidFill>
+                                  <a:prstDash val="solid"/>
+                                </a:ln>
+                              </wps:spPr>
+                              <wps:bodyPr wrap="square" lIns="0" tIns="0" rIns="0" bIns="0" rtlCol="0">
+                                <a:prstTxWarp prst="textNoShape">
+                                  <a:avLst/>
+                                </a:prstTxWarp>
+                                <a:noAutofit/>
+                              </wps:bodyPr>
+                            </wps:wsp>
+                          </wpg:wgp>
+                        </a:graphicData>
+                      </a:graphic>
+                    </wp:inline>
+                  </w:drawing>
+                </mc:Choice>
+                <mc:Fallback>
+                  <w:pict>
+                    <v:group w14:anchorId="73C3587B" id="Group 18" o:spid="_x0000_s1026" style="width:109pt;height:1pt;mso-position-horizontal-relative:char;mso-position-vertical-relative:line" coordsize="13843,127" o:gfxdata="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">
+                      <v:shape id="Graphic 19" o:spid="_x0000_s1027" style="position:absolute;top:63;width:13843;height:13;visibility:visible;mso-wrap-style:square;v-text-anchor:top" coordsize="1384300,1270" o:gfxdata="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" path="m,l1384300,e" filled="f" strokeweight="1pt">
+                        <v:path arrowok="t"/>
+                      </v:shape>
+                      <w10:anchorlock/>
+                    </v:group>
+                  </w:pict>
+                </mc:Fallback>
+              </mc:AlternateContent>
             </w:r>
           </w:p>
           <w:p>
             <w:pPr>
               <w:pStyle w:val="TableParagraph"/>
-              <w:spacing w:line="122" w:lineRule="exact"/>
-              <w:ind w:left="105"/>
+              <w:jc w:val="center"/>
+              <w:rPr>
+                <w:sz w:val="12"/>
+                <w:szCs w:val="12"/>
+              </w:rPr>
+            </w:pPr>
+            <w:r>
               <w:rPr>
                 <w:b/>
                 <w:sz w:val="14"/>
               </w:rPr>
-            </w:pPr>
+              <w:t>Fecha</w:t>
+            </w:r>
+            <w:r>
+              <w:rPr>
+                <w:rFonts w:ascii="Times New Roman"/>
+                <w:spacing w:val="-9"/>
+                <w:sz w:val="14"/>
+              </w:rPr>
+              <w:t xml:space="preserve"> </w:t>
+            </w:r>
             <w:r>
               <w:rPr>
                 <w:b/>
                 <w:sz w:val="14"/>
               </w:rPr>
-              <w:t>No.</w:t>
-            </w:r>
-            <w:r>
-              <w:rPr>
-                <w:rFonts w:ascii="Times New Roman" w:hAnsi="Times New Roman"/>
-                <w:spacing w:val="-8"/>
+              <w:t>de</w:t>
+            </w:r>
+            <w:r>
+              <w:rPr>
+                <w:rFonts w:ascii="Times New Roman"/>
+                <w:spacing w:val="-9"/>
                 <w:sz w:val="14"/>
               </w:rPr>
               <w:t xml:space="preserve"> </w:t>
@@ -12358,12 +12414,12 @@
                 <w:b/>
                 <w:sz w:val="14"/>
               </w:rPr>
-              <w:t>Cédula:</w:t>
-            </w:r>
-            <w:r>
-              <w:rPr>
-                <w:rFonts w:ascii="Times New Roman" w:hAnsi="Times New Roman"/>
-                <w:spacing w:val="-7"/>
+              <w:t>Recibido</w:t>
+            </w:r>
+            <w:r>
+              <w:rPr>
+                <w:rFonts w:ascii="Times New Roman"/>
+                <w:spacing w:val="40"/>
                 <w:sz w:val="14"/>
               </w:rPr>
               <w:t xml:space="preserve"> </w:t>
@@ -12373,19 +12429,67 @@
                 <w:b/>
                 <w:sz w:val="14"/>
               </w:rPr>
-              <w:t>{custom.Identificacion</w:t>
+              <w:t>Global</w:t>
+            </w:r>
+            <w:r>
+              <w:rPr>
+                <w:rFonts w:ascii="Times New Roman"/>
+                <w:sz w:val="14"/>
+              </w:rPr>
+              <w:t xml:space="preserve"> </w:t>
             </w:r>
             <w:r>
               <w:rPr>
                 <w:b/>
                 <w:sz w:val="14"/>
               </w:rPr>
-              <w:t>Aseg</w:t>
-            </w:r>
-            <w:r>
-              <w:rPr>
-                <w:b/>
-                <w:sz w:val="14"/>
+              <w:t>S.A.</w:t>
+            </w:r>
+          </w:p>
+          <w:p>
+            <w:pPr>
+              <w:pStyle w:val="TableParagraph"/>
+              <w:tabs>
+                <w:tab w:val="left" w:pos="5561"/>
+                <w:tab w:val="left" w:pos="9605"/>
+                <w:tab w:val="left" w:pos="9799"/>
+              </w:tabs>
+              <w:spacing w:line="254" w:lineRule="auto"/>
+              <w:ind w:left="6201" w:right="478" w:hanging="6076"/>
+              <w:jc w:val="center"/>
+              <w:rPr>
+                <w:sz w:val="16"/>
+                <w:szCs w:val="16"/>
+              </w:rPr>
+            </w:pPr>
+            <w:r>
+              <w:rPr>
+                <w:spacing w:val="-2"/>
+                <w:position w:val="-8"/>
+                <w:sz w:val="16"/>
+                <w:szCs w:val="16"/>
+              </w:rPr>
+              <w:t>{</w:t>
+            </w:r>
+            <w:proofErr w:type="spellStart"/>
+            <w:proofErr w:type="gramStart"/>
+            <w:r>
+              <w:rPr>
+                <w:spacing w:val="-2"/>
+                <w:position w:val="-8"/>
+                <w:sz w:val="16"/>
+                <w:szCs w:val="16"/>
+              </w:rPr>
+              <w:t>custom.FechaActual</w:t>
+            </w:r>
+            <w:proofErr w:type="spellEnd"/>
+            <w:proofErr w:type="gramEnd"/>
+            <w:r>
+              <w:rPr>
+                <w:spacing w:val="-2"/>
+                <w:position w:val="-8"/>
+                <w:sz w:val="16"/>
+                <w:szCs w:val="16"/>
               </w:rPr>
               <w:t>}</w:t>
             </w:r>
@@ -12441,15 +12545,15 @@
       <mc:AlternateContent>
         <mc:Choice Requires="wps">
           <w:drawing>
-            <wp:anchor distT="0" distB="0" distL="0" distR="0" simplePos="0" relativeHeight="487475712" behindDoc="1" locked="0" layoutInCell="1" allowOverlap="1" wp14:anchorId="760FCEA7" wp14:editId="5777CCAF">
+            <wp:anchor distT="0" distB="0" distL="0" distR="0" simplePos="0" relativeHeight="487475712" behindDoc="1" locked="0" layoutInCell="1" allowOverlap="1" wp14:anchorId="760FCEA7" wp14:editId="34FF2CED">
               <wp:simplePos x="0" y="0"/>
               <wp:positionH relativeFrom="page">
-                <wp:posOffset>130175</wp:posOffset>
+                <wp:posOffset>130628</wp:posOffset>
               </wp:positionH>
               <wp:positionV relativeFrom="page">
-                <wp:posOffset>9658696</wp:posOffset>
+                <wp:posOffset>9656466</wp:posOffset>
               </wp:positionV>
-              <wp:extent cx="3563620" cy="127000"/>
+              <wp:extent cx="5457371" cy="173334"/>
               <wp:effectExtent l="0" t="0" r="0" b="0"/>
               <wp:wrapNone/>
               <wp:docPr id="1" name="Textbox 1"/>
@@ -12465,7 +12569,7 @@
                     <wps:spPr>
                       <a:xfrm>
                         <a:off x="0" y="0"/>
-                        <a:ext cx="3563620" cy="127000"/>
+                        <a:ext cx="5457371" cy="173334"/>
                       </a:xfrm>
                       <a:prstGeom prst="rect">
                         <a:avLst/>
@@ -12651,6 +12755,12 @@
                   </wps:wsp>
                 </a:graphicData>
               </a:graphic>
+              <wp14:sizeRelH relativeFrom="margin">
+                <wp14:pctWidth>0</wp14:pctWidth>
+              </wp14:sizeRelH>
+              <wp14:sizeRelV relativeFrom="margin">
+                <wp14:pctHeight>0</wp14:pctHeight>
+              </wp14:sizeRelV>
             </wp:anchor>
           </w:drawing>
         </mc:Choice>
@@ -12660,7 +12770,7 @@
               <v:stroke joinstyle="miter"/>
               <v:path gradientshapeok="t" o:connecttype="rect"/>
             </v:shapetype>
-            <v:shape id="Textbox 1" o:spid="_x0000_s1033" type="#_x0000_t202" style="position:absolute;margin-left:10.25pt;margin-top:760.55pt;width:280.6pt;height:10pt;z-index:-15840768;visibility:visible;mso-wrap-style:square;mso-wrap-distance-left:0;mso-wrap-distance-top:0;mso-wrap-distance-right:0;mso-wrap-distance-bottom:0;mso-position-horizontal:absolute;mso-position-horizontal-relative:page;mso-position-vertical:absolute;mso-position-vertical-relative:page;v-text-anchor:top" o:gfxdata="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" filled="f" stroked="f">
+            <v:shape id="Textbox 1" o:spid="_x0000_s1033" type="#_x0000_t202" style="position:absolute;margin-left:10.3pt;margin-top:760.35pt;width:429.7pt;height:13.65pt;z-index:-15840768;visibility:visible;mso-wrap-style:square;mso-width-percent:0;mso-height-percent:0;mso-wrap-distance-left:0;mso-wrap-distance-top:0;mso-wrap-distance-right:0;mso-wrap-distance-bottom:0;mso-position-horizontal:absolute;mso-position-horizontal-relative:page;mso-position-vertical:absolute;mso-position-vertical-relative:page;mso-width-percent:0;mso-height-percent:0;mso-width-relative:margin;mso-height-relative:margin;v-text-anchor:top" o:gfxdata="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" filled="f" stroked="f">
               <v:textbox inset="0,0,0,0">
                 <w:txbxContent>
                   <w:p>
@@ -13504,6 +13614,56 @@
       <w:rFonts w:ascii="Arial" w:eastAsia="Arial" w:hAnsi="Arial" w:cs="Arial"/>
     </w:rPr>
   </w:style>
+  <w:style w:type="paragraph" w:styleId="Encabezado">
+    <w:name w:val="header"/>
+    <w:basedOn w:val="Normal"/>
+    <w:link w:val="EncabezadoCar"/>
+    <w:uiPriority w:val="99"/>
+    <w:unhideWhenUsed/>
+    <w:rsid w:val="00086757"/>
+    <w:pPr>
+      <w:tabs>
+        <w:tab w:val="center" w:pos="4419"/>
+        <w:tab w:val="right" w:pos="8838"/>
+      </w:tabs>
+    </w:pPr>
+  </w:style>
+  <w:style w:type="character" w:customStyle="1" w:styleId="EncabezadoCar">
+    <w:name w:val="Encabezado Car"/>
+    <w:basedOn w:val="Fuentedeprrafopredeter"/>
+    <w:link w:val="Encabezado"/>
+    <w:uiPriority w:val="99"/>
+    <w:rsid w:val="00086757"/>
+    <w:rPr>
+      <w:rFonts w:ascii="Arial MT" w:eastAsia="Arial MT" w:hAnsi="Arial MT" w:cs="Arial MT"/>
+      <w:lang w:val="es-ES"/>
+    </w:rPr>
+  </w:style>
+  <w:style w:type="paragraph" w:styleId="Piedepgina">
+    <w:name w:val="footer"/>
+    <w:basedOn w:val="Normal"/>
+    <w:link w:val="PiedepginaCar"/>
+    <w:uiPriority w:val="99"/>
+    <w:unhideWhenUsed/>
+    <w:rsid w:val="00086757"/>
+    <w:pPr>
+      <w:tabs>
+        <w:tab w:val="center" w:pos="4419"/>
+        <w:tab w:val="right" w:pos="8838"/>
+      </w:tabs>
+    </w:pPr>
+  </w:style>
+  <w:style w:type="character" w:customStyle="1" w:styleId="PiedepginaCar">
+    <w:name w:val="Pie de página Car"/>
+    <w:basedOn w:val="Fuentedeprrafopredeter"/>
+    <w:link w:val="Piedepgina"/>
+    <w:uiPriority w:val="99"/>
+    <w:rsid w:val="00086757"/>
+    <w:rPr>
+      <w:rFonts w:ascii="Arial MT" w:eastAsia="Arial MT" w:hAnsi="Arial MT" w:cs="Arial MT"/>
+      <w:lang w:val="es-ES"/>
+    </w:rPr>
+  </w:style>
 </w:styles>
 </file>
 

</xml_diff>